<commit_message>
Windmill 70597bb+ vendored: ruling 46 — the Unit 4 papers set in Lexend; the All in One folder (merged TEs, plans, assessments, keys); Unit 4 rebuilt and reinstalled at 0 findings
Co-Authored-By: Claude Fable 5.1 <noreply@anthropic.com>
Claude-Session: https://claude.ai/code/session_01B7ovt6yLjh6QuFV9HBMV4N
</commit_message>
<xml_diff>
--- a/a7/build/out/u4/A7 Unit 4 Solving Problems with Rational Numbers - Test - Key.docx
+++ b/a7/build/out/u4/A7 Unit 4 Solving Problems with Rational Numbers - Test - Key.docx
@@ -329,7 +329,7 @@
             <w:r>
               <w:drawing>
                 <wp:inline xmlns:a="http://schemas.openxmlformats.org/drawingml/2006/main" xmlns:pic="http://schemas.openxmlformats.org/drawingml/2006/picture">
-                  <wp:extent cx="1551432" cy="170688"/>
+                  <wp:extent cx="1520952" cy="161544"/>
                   <wp:docPr id="1" name="Picture 1"/>
                   <wp:cNvGraphicFramePr>
                     <a:graphicFrameLocks noChangeAspect="1"/>
@@ -338,7 +338,7 @@
                     <a:graphicData uri="http://schemas.openxmlformats.org/drawingml/2006/picture">
                       <pic:pic>
                         <pic:nvPicPr>
-                          <pic:cNvPr id="0" name="711bc2d13a079158.png"/>
+                          <pic:cNvPr id="0" name="ef2b6a8feb083944.png"/>
                           <pic:cNvPicPr/>
                         </pic:nvPicPr>
                         <pic:blipFill>
@@ -350,7 +350,7 @@
                         <pic:spPr>
                           <a:xfrm>
                             <a:off x="0" y="0"/>
-                            <a:ext cx="1551432" cy="170688"/>
+                            <a:ext cx="1520952" cy="161544"/>
                           </a:xfrm>
                           <a:prstGeom prst="rect"/>
                         </pic:spPr>
@@ -381,7 +381,7 @@
             <w:r>
               <w:drawing>
                 <wp:inline xmlns:a="http://schemas.openxmlformats.org/drawingml/2006/main" xmlns:pic="http://schemas.openxmlformats.org/drawingml/2006/picture">
-                  <wp:extent cx="573024" cy="146304"/>
+                  <wp:extent cx="566928" cy="134112"/>
                   <wp:docPr id="2" name="Picture 2"/>
                   <wp:cNvGraphicFramePr>
                     <a:graphicFrameLocks noChangeAspect="1"/>
@@ -390,7 +390,7 @@
                     <a:graphicData uri="http://schemas.openxmlformats.org/drawingml/2006/picture">
                       <pic:pic>
                         <pic:nvPicPr>
-                          <pic:cNvPr id="0" name="99ae048982be115e.png"/>
+                          <pic:cNvPr id="0" name="79edf39a3ac31856.png"/>
                           <pic:cNvPicPr/>
                         </pic:nvPicPr>
                         <pic:blipFill>
@@ -402,7 +402,7 @@
                         <pic:spPr>
                           <a:xfrm>
                             <a:off x="0" y="0"/>
-                            <a:ext cx="573024" cy="146304"/>
+                            <a:ext cx="566928" cy="134112"/>
                           </a:xfrm>
                           <a:prstGeom prst="rect"/>
                         </pic:spPr>
@@ -448,7 +448,7 @@
             <w:r>
               <w:drawing>
                 <wp:inline xmlns:a="http://schemas.openxmlformats.org/drawingml/2006/main" xmlns:pic="http://schemas.openxmlformats.org/drawingml/2006/picture">
-                  <wp:extent cx="1709928" cy="173736"/>
+                  <wp:extent cx="1673352" cy="161544"/>
                   <wp:docPr id="3" name="Picture 3"/>
                   <wp:cNvGraphicFramePr>
                     <a:graphicFrameLocks noChangeAspect="1"/>
@@ -457,7 +457,7 @@
                     <a:graphicData uri="http://schemas.openxmlformats.org/drawingml/2006/picture">
                       <pic:pic>
                         <pic:nvPicPr>
-                          <pic:cNvPr id="0" name="082c85d6df4a02a2.png"/>
+                          <pic:cNvPr id="0" name="78a2c6cfa34e4e5f.png"/>
                           <pic:cNvPicPr/>
                         </pic:nvPicPr>
                         <pic:blipFill>
@@ -469,7 +469,7 @@
                         <pic:spPr>
                           <a:xfrm>
                             <a:off x="0" y="0"/>
-                            <a:ext cx="1709928" cy="173736"/>
+                            <a:ext cx="1673352" cy="161544"/>
                           </a:xfrm>
                           <a:prstGeom prst="rect"/>
                         </pic:spPr>
@@ -500,7 +500,7 @@
             <w:r>
               <w:drawing>
                 <wp:inline xmlns:a="http://schemas.openxmlformats.org/drawingml/2006/main" xmlns:pic="http://schemas.openxmlformats.org/drawingml/2006/picture">
-                  <wp:extent cx="655320" cy="149352"/>
+                  <wp:extent cx="633984" cy="134112"/>
                   <wp:docPr id="4" name="Picture 4"/>
                   <wp:cNvGraphicFramePr>
                     <a:graphicFrameLocks noChangeAspect="1"/>
@@ -509,7 +509,7 @@
                     <a:graphicData uri="http://schemas.openxmlformats.org/drawingml/2006/picture">
                       <pic:pic>
                         <pic:nvPicPr>
-                          <pic:cNvPr id="0" name="970096af52e72312.png"/>
+                          <pic:cNvPr id="0" name="df4d8cd21f86f4f3.png"/>
                           <pic:cNvPicPr/>
                         </pic:nvPicPr>
                         <pic:blipFill>
@@ -521,7 +521,7 @@
                         <pic:spPr>
                           <a:xfrm>
                             <a:off x="0" y="0"/>
-                            <a:ext cx="655320" cy="149352"/>
+                            <a:ext cx="633984" cy="134112"/>
                           </a:xfrm>
                           <a:prstGeom prst="rect"/>
                         </pic:spPr>
@@ -552,7 +552,7 @@
             <w:r>
               <w:drawing>
                 <wp:inline xmlns:a="http://schemas.openxmlformats.org/drawingml/2006/main" xmlns:pic="http://schemas.openxmlformats.org/drawingml/2006/picture">
-                  <wp:extent cx="1551432" cy="170688"/>
+                  <wp:extent cx="1539240" cy="161544"/>
                   <wp:docPr id="5" name="Picture 5"/>
                   <wp:cNvGraphicFramePr>
                     <a:graphicFrameLocks noChangeAspect="1"/>
@@ -561,7 +561,7 @@
                     <a:graphicData uri="http://schemas.openxmlformats.org/drawingml/2006/picture">
                       <pic:pic>
                         <pic:nvPicPr>
-                          <pic:cNvPr id="0" name="2b9aad315a5cd596.png"/>
+                          <pic:cNvPr id="0" name="e6eae71a5e4b8b08.png"/>
                           <pic:cNvPicPr/>
                         </pic:nvPicPr>
                         <pic:blipFill>
@@ -573,7 +573,7 @@
                         <pic:spPr>
                           <a:xfrm>
                             <a:off x="0" y="0"/>
-                            <a:ext cx="1551432" cy="170688"/>
+                            <a:ext cx="1539240" cy="161544"/>
                           </a:xfrm>
                           <a:prstGeom prst="rect"/>
                         </pic:spPr>
@@ -604,7 +604,7 @@
             <w:r>
               <w:drawing>
                 <wp:inline xmlns:a="http://schemas.openxmlformats.org/drawingml/2006/main" xmlns:pic="http://schemas.openxmlformats.org/drawingml/2006/picture">
-                  <wp:extent cx="643128" cy="146304"/>
+                  <wp:extent cx="646176" cy="134112"/>
                   <wp:docPr id="6" name="Picture 6"/>
                   <wp:cNvGraphicFramePr>
                     <a:graphicFrameLocks noChangeAspect="1"/>
@@ -613,7 +613,7 @@
                     <a:graphicData uri="http://schemas.openxmlformats.org/drawingml/2006/picture">
                       <pic:pic>
                         <pic:nvPicPr>
-                          <pic:cNvPr id="0" name="53d2cd5c43f3659a.png"/>
+                          <pic:cNvPr id="0" name="2b339626e159566e.png"/>
                           <pic:cNvPicPr/>
                         </pic:nvPicPr>
                         <pic:blipFill>
@@ -625,7 +625,7 @@
                         <pic:spPr>
                           <a:xfrm>
                             <a:off x="0" y="0"/>
-                            <a:ext cx="643128" cy="146304"/>
+                            <a:ext cx="646176" cy="134112"/>
                           </a:xfrm>
                           <a:prstGeom prst="rect"/>
                         </pic:spPr>
@@ -644,7 +644,7 @@
             <w:r>
               <w:drawing>
                 <wp:inline xmlns:a="http://schemas.openxmlformats.org/drawingml/2006/main" xmlns:pic="http://schemas.openxmlformats.org/drawingml/2006/picture">
-                  <wp:extent cx="640080" cy="146304"/>
+                  <wp:extent cx="646176" cy="134112"/>
                   <wp:docPr id="7" name="Picture 7"/>
                   <wp:cNvGraphicFramePr>
                     <a:graphicFrameLocks noChangeAspect="1"/>
@@ -653,7 +653,7 @@
                     <a:graphicData uri="http://schemas.openxmlformats.org/drawingml/2006/picture">
                       <pic:pic>
                         <pic:nvPicPr>
-                          <pic:cNvPr id="0" name="3b6a4c7c8eaa079b.png"/>
+                          <pic:cNvPr id="0" name="e31cc9bf0ad4eedd.png"/>
                           <pic:cNvPicPr/>
                         </pic:nvPicPr>
                         <pic:blipFill>
@@ -665,7 +665,7 @@
                         <pic:spPr>
                           <a:xfrm>
                             <a:off x="0" y="0"/>
-                            <a:ext cx="640080" cy="146304"/>
+                            <a:ext cx="646176" cy="134112"/>
                           </a:xfrm>
                           <a:prstGeom prst="rect"/>
                         </pic:spPr>
@@ -705,7 +705,7 @@
             <w:r>
               <w:drawing>
                 <wp:inline xmlns:a="http://schemas.openxmlformats.org/drawingml/2006/main" xmlns:pic="http://schemas.openxmlformats.org/drawingml/2006/picture">
-                  <wp:extent cx="1551432" cy="170688"/>
+                  <wp:extent cx="1539240" cy="161544"/>
                   <wp:docPr id="8" name="Picture 8"/>
                   <wp:cNvGraphicFramePr>
                     <a:graphicFrameLocks noChangeAspect="1"/>
@@ -714,7 +714,7 @@
                     <a:graphicData uri="http://schemas.openxmlformats.org/drawingml/2006/picture">
                       <pic:pic>
                         <pic:nvPicPr>
-                          <pic:cNvPr id="0" name="5bdf445f1cbfe124.png"/>
+                          <pic:cNvPr id="0" name="d5f83b2d2e3097f5.png"/>
                           <pic:cNvPicPr/>
                         </pic:nvPicPr>
                         <pic:blipFill>
@@ -726,7 +726,7 @@
                         <pic:spPr>
                           <a:xfrm>
                             <a:off x="0" y="0"/>
-                            <a:ext cx="1551432" cy="170688"/>
+                            <a:ext cx="1539240" cy="161544"/>
                           </a:xfrm>
                           <a:prstGeom prst="rect"/>
                         </pic:spPr>
@@ -757,7 +757,7 @@
             <w:r>
               <w:drawing>
                 <wp:inline xmlns:a="http://schemas.openxmlformats.org/drawingml/2006/main" xmlns:pic="http://schemas.openxmlformats.org/drawingml/2006/picture">
-                  <wp:extent cx="661416" cy="146304"/>
+                  <wp:extent cx="673608" cy="134112"/>
                   <wp:docPr id="9" name="Picture 9"/>
                   <wp:cNvGraphicFramePr>
                     <a:graphicFrameLocks noChangeAspect="1"/>
@@ -766,7 +766,7 @@
                     <a:graphicData uri="http://schemas.openxmlformats.org/drawingml/2006/picture">
                       <pic:pic>
                         <pic:nvPicPr>
-                          <pic:cNvPr id="0" name="6505b873a9cc78c6.png"/>
+                          <pic:cNvPr id="0" name="4c5a99012b545f70.png"/>
                           <pic:cNvPicPr/>
                         </pic:nvPicPr>
                         <pic:blipFill>
@@ -778,7 +778,7 @@
                         <pic:spPr>
                           <a:xfrm>
                             <a:off x="0" y="0"/>
-                            <a:ext cx="661416" cy="146304"/>
+                            <a:ext cx="673608" cy="134112"/>
                           </a:xfrm>
                           <a:prstGeom prst="rect"/>
                         </pic:spPr>
@@ -797,7 +797,7 @@
             <w:r>
               <w:drawing>
                 <wp:inline xmlns:a="http://schemas.openxmlformats.org/drawingml/2006/main" xmlns:pic="http://schemas.openxmlformats.org/drawingml/2006/picture">
-                  <wp:extent cx="1408176" cy="146304"/>
+                  <wp:extent cx="1386840" cy="134112"/>
                   <wp:docPr id="10" name="Picture 10"/>
                   <wp:cNvGraphicFramePr>
                     <a:graphicFrameLocks noChangeAspect="1"/>
@@ -806,7 +806,7 @@
                     <a:graphicData uri="http://schemas.openxmlformats.org/drawingml/2006/picture">
                       <pic:pic>
                         <pic:nvPicPr>
-                          <pic:cNvPr id="0" name="332468f90ad30fe2.png"/>
+                          <pic:cNvPr id="0" name="01ee86710eff481b.png"/>
                           <pic:cNvPicPr/>
                         </pic:nvPicPr>
                         <pic:blipFill>
@@ -818,7 +818,7 @@
                         <pic:spPr>
                           <a:xfrm>
                             <a:off x="0" y="0"/>
-                            <a:ext cx="1408176" cy="146304"/>
+                            <a:ext cx="1386840" cy="134112"/>
                           </a:xfrm>
                           <a:prstGeom prst="rect"/>
                         </pic:spPr>
@@ -940,7 +940,7 @@
             <w:r>
               <w:drawing>
                 <wp:inline xmlns:a="http://schemas.openxmlformats.org/drawingml/2006/main" xmlns:pic="http://schemas.openxmlformats.org/drawingml/2006/picture">
-                  <wp:extent cx="1143000" cy="170688"/>
+                  <wp:extent cx="1136904" cy="161544"/>
                   <wp:docPr id="11" name="Picture 11"/>
                   <wp:cNvGraphicFramePr>
                     <a:graphicFrameLocks noChangeAspect="1"/>
@@ -949,7 +949,7 @@
                     <a:graphicData uri="http://schemas.openxmlformats.org/drawingml/2006/picture">
                       <pic:pic>
                         <pic:nvPicPr>
-                          <pic:cNvPr id="0" name="d5191e68afd81d2a.png"/>
+                          <pic:cNvPr id="0" name="795f2d6fda12fce7.png"/>
                           <pic:cNvPicPr/>
                         </pic:nvPicPr>
                         <pic:blipFill>
@@ -961,7 +961,7 @@
                         <pic:spPr>
                           <a:xfrm>
                             <a:off x="0" y="0"/>
-                            <a:ext cx="1143000" cy="170688"/>
+                            <a:ext cx="1136904" cy="161544"/>
                           </a:xfrm>
                           <a:prstGeom prst="rect"/>
                         </pic:spPr>
@@ -992,7 +992,7 @@
             <w:r>
               <w:drawing>
                 <wp:inline xmlns:a="http://schemas.openxmlformats.org/drawingml/2006/main" xmlns:pic="http://schemas.openxmlformats.org/drawingml/2006/picture">
-                  <wp:extent cx="512064" cy="146304"/>
+                  <wp:extent cx="505968" cy="134112"/>
                   <wp:docPr id="12" name="Picture 12"/>
                   <wp:cNvGraphicFramePr>
                     <a:graphicFrameLocks noChangeAspect="1"/>
@@ -1001,7 +1001,7 @@
                     <a:graphicData uri="http://schemas.openxmlformats.org/drawingml/2006/picture">
                       <pic:pic>
                         <pic:nvPicPr>
-                          <pic:cNvPr id="0" name="f0c38f8ea3aa66e7.png"/>
+                          <pic:cNvPr id="0" name="46c8e994b0702e64.png"/>
                           <pic:cNvPicPr/>
                         </pic:nvPicPr>
                         <pic:blipFill>
@@ -1013,7 +1013,7 @@
                         <pic:spPr>
                           <a:xfrm>
                             <a:off x="0" y="0"/>
-                            <a:ext cx="512064" cy="146304"/>
+                            <a:ext cx="505968" cy="134112"/>
                           </a:xfrm>
                           <a:prstGeom prst="rect"/>
                         </pic:spPr>
@@ -1044,7 +1044,7 @@
             <w:r>
               <w:drawing>
                 <wp:inline xmlns:a="http://schemas.openxmlformats.org/drawingml/2006/main" xmlns:pic="http://schemas.openxmlformats.org/drawingml/2006/picture">
-                  <wp:extent cx="417576" cy="252984"/>
+                  <wp:extent cx="411480" cy="234696"/>
                   <wp:docPr id="13" name="Picture 13"/>
                   <wp:cNvGraphicFramePr>
                     <a:graphicFrameLocks noChangeAspect="1"/>
@@ -1053,7 +1053,7 @@
                     <a:graphicData uri="http://schemas.openxmlformats.org/drawingml/2006/picture">
                       <pic:pic>
                         <pic:nvPicPr>
-                          <pic:cNvPr id="0" name="2b08c3f923512f51.png"/>
+                          <pic:cNvPr id="0" name="c92304b6424a9b09.png"/>
                           <pic:cNvPicPr/>
                         </pic:nvPicPr>
                         <pic:blipFill>
@@ -1065,7 +1065,7 @@
                         <pic:spPr>
                           <a:xfrm>
                             <a:off x="0" y="0"/>
-                            <a:ext cx="417576" cy="252984"/>
+                            <a:ext cx="411480" cy="234696"/>
                           </a:xfrm>
                           <a:prstGeom prst="rect"/>
                         </pic:spPr>
@@ -1096,7 +1096,7 @@
             <w:r>
               <w:drawing>
                 <wp:inline xmlns:a="http://schemas.openxmlformats.org/drawingml/2006/main" xmlns:pic="http://schemas.openxmlformats.org/drawingml/2006/picture">
-                  <wp:extent cx="445008" cy="146304"/>
+                  <wp:extent cx="448056" cy="134112"/>
                   <wp:docPr id="14" name="Picture 14"/>
                   <wp:cNvGraphicFramePr>
                     <a:graphicFrameLocks noChangeAspect="1"/>
@@ -1105,7 +1105,7 @@
                     <a:graphicData uri="http://schemas.openxmlformats.org/drawingml/2006/picture">
                       <pic:pic>
                         <pic:nvPicPr>
-                          <pic:cNvPr id="0" name="9fb0e04624a50c90.png"/>
+                          <pic:cNvPr id="0" name="c7734ce719499f70.png"/>
                           <pic:cNvPicPr/>
                         </pic:nvPicPr>
                         <pic:blipFill>
@@ -1117,7 +1117,7 @@
                         <pic:spPr>
                           <a:xfrm>
                             <a:off x="0" y="0"/>
-                            <a:ext cx="445008" cy="146304"/>
+                            <a:ext cx="448056" cy="134112"/>
                           </a:xfrm>
                           <a:prstGeom prst="rect"/>
                         </pic:spPr>
@@ -1148,7 +1148,7 @@
             <w:r>
               <w:drawing>
                 <wp:inline xmlns:a="http://schemas.openxmlformats.org/drawingml/2006/main" xmlns:pic="http://schemas.openxmlformats.org/drawingml/2006/picture">
-                  <wp:extent cx="1222248" cy="170688"/>
+                  <wp:extent cx="1207008" cy="161544"/>
                   <wp:docPr id="15" name="Picture 15"/>
                   <wp:cNvGraphicFramePr>
                     <a:graphicFrameLocks noChangeAspect="1"/>
@@ -1157,7 +1157,7 @@
                     <a:graphicData uri="http://schemas.openxmlformats.org/drawingml/2006/picture">
                       <pic:pic>
                         <pic:nvPicPr>
-                          <pic:cNvPr id="0" name="60d72c129de729cc.png"/>
+                          <pic:cNvPr id="0" name="9caffc9abae5d9f6.png"/>
                           <pic:cNvPicPr/>
                         </pic:nvPicPr>
                         <pic:blipFill>
@@ -1169,7 +1169,7 @@
                         <pic:spPr>
                           <a:xfrm>
                             <a:off x="0" y="0"/>
-                            <a:ext cx="1222248" cy="170688"/>
+                            <a:ext cx="1207008" cy="161544"/>
                           </a:xfrm>
                           <a:prstGeom prst="rect"/>
                         </pic:spPr>
@@ -1200,7 +1200,7 @@
             <w:r>
               <w:drawing>
                 <wp:inline xmlns:a="http://schemas.openxmlformats.org/drawingml/2006/main" xmlns:pic="http://schemas.openxmlformats.org/drawingml/2006/picture">
-                  <wp:extent cx="451104" cy="146304"/>
+                  <wp:extent cx="445008" cy="134112"/>
                   <wp:docPr id="16" name="Picture 16"/>
                   <wp:cNvGraphicFramePr>
                     <a:graphicFrameLocks noChangeAspect="1"/>
@@ -1209,7 +1209,7 @@
                     <a:graphicData uri="http://schemas.openxmlformats.org/drawingml/2006/picture">
                       <pic:pic>
                         <pic:nvPicPr>
-                          <pic:cNvPr id="0" name="12394ffd973ca867.png"/>
+                          <pic:cNvPr id="0" name="4d6965bb56410ebe.png"/>
                           <pic:cNvPicPr/>
                         </pic:nvPicPr>
                         <pic:blipFill>
@@ -1221,7 +1221,7 @@
                         <pic:spPr>
                           <a:xfrm>
                             <a:off x="0" y="0"/>
-                            <a:ext cx="451104" cy="146304"/>
+                            <a:ext cx="445008" cy="134112"/>
                           </a:xfrm>
                           <a:prstGeom prst="rect"/>
                         </pic:spPr>
@@ -1240,7 +1240,7 @@
             <w:r>
               <w:drawing>
                 <wp:inline xmlns:a="http://schemas.openxmlformats.org/drawingml/2006/main" xmlns:pic="http://schemas.openxmlformats.org/drawingml/2006/picture">
-                  <wp:extent cx="536448" cy="146304"/>
+                  <wp:extent cx="545592" cy="134112"/>
                   <wp:docPr id="17" name="Picture 17"/>
                   <wp:cNvGraphicFramePr>
                     <a:graphicFrameLocks noChangeAspect="1"/>
@@ -1249,7 +1249,7 @@
                     <a:graphicData uri="http://schemas.openxmlformats.org/drawingml/2006/picture">
                       <pic:pic>
                         <pic:nvPicPr>
-                          <pic:cNvPr id="0" name="f51985219b034aa3.png"/>
+                          <pic:cNvPr id="0" name="f81e4f136a832452.png"/>
                           <pic:cNvPicPr/>
                         </pic:nvPicPr>
                         <pic:blipFill>
@@ -1261,7 +1261,7 @@
                         <pic:spPr>
                           <a:xfrm>
                             <a:off x="0" y="0"/>
-                            <a:ext cx="536448" cy="146304"/>
+                            <a:ext cx="545592" cy="134112"/>
                           </a:xfrm>
                           <a:prstGeom prst="rect"/>
                         </pic:spPr>
@@ -1301,7 +1301,7 @@
             <w:r>
               <w:drawing>
                 <wp:inline xmlns:a="http://schemas.openxmlformats.org/drawingml/2006/main" xmlns:pic="http://schemas.openxmlformats.org/drawingml/2006/picture">
-                  <wp:extent cx="417576" cy="252984"/>
+                  <wp:extent cx="408432" cy="234696"/>
                   <wp:docPr id="18" name="Picture 18"/>
                   <wp:cNvGraphicFramePr>
                     <a:graphicFrameLocks noChangeAspect="1"/>
@@ -1310,7 +1310,7 @@
                     <a:graphicData uri="http://schemas.openxmlformats.org/drawingml/2006/picture">
                       <pic:pic>
                         <pic:nvPicPr>
-                          <pic:cNvPr id="0" name="c37efc7d16378548.png"/>
+                          <pic:cNvPr id="0" name="7c6314322e310ae9.png"/>
                           <pic:cNvPicPr/>
                         </pic:nvPicPr>
                         <pic:blipFill>
@@ -1322,7 +1322,7 @@
                         <pic:spPr>
                           <a:xfrm>
                             <a:off x="0" y="0"/>
-                            <a:ext cx="417576" cy="252984"/>
+                            <a:ext cx="408432" cy="234696"/>
                           </a:xfrm>
                           <a:prstGeom prst="rect"/>
                         </pic:spPr>
@@ -1353,7 +1353,7 @@
             <w:r>
               <w:drawing>
                 <wp:inline xmlns:a="http://schemas.openxmlformats.org/drawingml/2006/main" xmlns:pic="http://schemas.openxmlformats.org/drawingml/2006/picture">
-                  <wp:extent cx="530352" cy="146304"/>
+                  <wp:extent cx="515112" cy="134112"/>
                   <wp:docPr id="19" name="Picture 19"/>
                   <wp:cNvGraphicFramePr>
                     <a:graphicFrameLocks noChangeAspect="1"/>
@@ -1362,7 +1362,7 @@
                     <a:graphicData uri="http://schemas.openxmlformats.org/drawingml/2006/picture">
                       <pic:pic>
                         <pic:nvPicPr>
-                          <pic:cNvPr id="0" name="77e2420ce0fdad9b.png"/>
+                          <pic:cNvPr id="0" name="b1c298afbf81173b.png"/>
                           <pic:cNvPicPr/>
                         </pic:nvPicPr>
                         <pic:blipFill>
@@ -1374,7 +1374,7 @@
                         <pic:spPr>
                           <a:xfrm>
                             <a:off x="0" y="0"/>
-                            <a:ext cx="530352" cy="146304"/>
+                            <a:ext cx="515112" cy="134112"/>
                           </a:xfrm>
                           <a:prstGeom prst="rect"/>
                         </pic:spPr>
@@ -1393,7 +1393,7 @@
             <w:r>
               <w:drawing>
                 <wp:inline xmlns:a="http://schemas.openxmlformats.org/drawingml/2006/main" xmlns:pic="http://schemas.openxmlformats.org/drawingml/2006/picture">
-                  <wp:extent cx="652272" cy="146304"/>
+                  <wp:extent cx="633984" cy="134112"/>
                   <wp:docPr id="20" name="Picture 20"/>
                   <wp:cNvGraphicFramePr>
                     <a:graphicFrameLocks noChangeAspect="1"/>
@@ -1402,7 +1402,7 @@
                     <a:graphicData uri="http://schemas.openxmlformats.org/drawingml/2006/picture">
                       <pic:pic>
                         <pic:nvPicPr>
-                          <pic:cNvPr id="0" name="504fdcd076d58c19.png"/>
+                          <pic:cNvPr id="0" name="4648986b0b339971.png"/>
                           <pic:cNvPicPr/>
                         </pic:nvPicPr>
                         <pic:blipFill>
@@ -1414,7 +1414,7 @@
                         <pic:spPr>
                           <a:xfrm>
                             <a:off x="0" y="0"/>
-                            <a:ext cx="652272" cy="146304"/>
+                            <a:ext cx="633984" cy="134112"/>
                           </a:xfrm>
                           <a:prstGeom prst="rect"/>
                         </pic:spPr>
@@ -1521,7 +1521,7 @@
             <w:r>
               <w:drawing>
                 <wp:inline xmlns:a="http://schemas.openxmlformats.org/drawingml/2006/main" xmlns:pic="http://schemas.openxmlformats.org/drawingml/2006/picture">
-                  <wp:extent cx="1551432" cy="170688"/>
+                  <wp:extent cx="1530096" cy="161544"/>
                   <wp:docPr id="21" name="Picture 21"/>
                   <wp:cNvGraphicFramePr>
                     <a:graphicFrameLocks noChangeAspect="1"/>
@@ -1530,7 +1530,7 @@
                     <a:graphicData uri="http://schemas.openxmlformats.org/drawingml/2006/picture">
                       <pic:pic>
                         <pic:nvPicPr>
-                          <pic:cNvPr id="0" name="a2ceedea1815d369.png"/>
+                          <pic:cNvPr id="0" name="be94747970c58e90.png"/>
                           <pic:cNvPicPr/>
                         </pic:nvPicPr>
                         <pic:blipFill>
@@ -1542,7 +1542,7 @@
                         <pic:spPr>
                           <a:xfrm>
                             <a:off x="0" y="0"/>
-                            <a:ext cx="1551432" cy="170688"/>
+                            <a:ext cx="1530096" cy="161544"/>
                           </a:xfrm>
                           <a:prstGeom prst="rect"/>
                         </pic:spPr>
@@ -1601,7 +1601,7 @@
             <w:r>
               <w:drawing>
                 <wp:inline xmlns:a="http://schemas.openxmlformats.org/drawingml/2006/main" xmlns:pic="http://schemas.openxmlformats.org/drawingml/2006/picture">
-                  <wp:extent cx="652272" cy="146304"/>
+                  <wp:extent cx="673608" cy="134112"/>
                   <wp:docPr id="22" name="Picture 22"/>
                   <wp:cNvGraphicFramePr>
                     <a:graphicFrameLocks noChangeAspect="1"/>
@@ -1610,7 +1610,7 @@
                     <a:graphicData uri="http://schemas.openxmlformats.org/drawingml/2006/picture">
                       <pic:pic>
                         <pic:nvPicPr>
-                          <pic:cNvPr id="0" name="985ca6630d6cfe16.png"/>
+                          <pic:cNvPr id="0" name="2e936ff66663e46b.png"/>
                           <pic:cNvPicPr/>
                         </pic:nvPicPr>
                         <pic:blipFill>
@@ -1622,7 +1622,7 @@
                         <pic:spPr>
                           <a:xfrm>
                             <a:off x="0" y="0"/>
-                            <a:ext cx="652272" cy="146304"/>
+                            <a:ext cx="673608" cy="134112"/>
                           </a:xfrm>
                           <a:prstGeom prst="rect"/>
                         </pic:spPr>
@@ -1660,7 +1660,7 @@
             <w:r>
               <w:drawing>
                 <wp:inline xmlns:a="http://schemas.openxmlformats.org/drawingml/2006/main" xmlns:pic="http://schemas.openxmlformats.org/drawingml/2006/picture">
-                  <wp:extent cx="576072" cy="146304"/>
+                  <wp:extent cx="576072" cy="134112"/>
                   <wp:docPr id="23" name="Picture 23"/>
                   <wp:cNvGraphicFramePr>
                     <a:graphicFrameLocks noChangeAspect="1"/>
@@ -1669,7 +1669,7 @@
                     <a:graphicData uri="http://schemas.openxmlformats.org/drawingml/2006/picture">
                       <pic:pic>
                         <pic:nvPicPr>
-                          <pic:cNvPr id="0" name="ad21cf01b5fb7d8a.png"/>
+                          <pic:cNvPr id="0" name="5d365c448fbc0d26.png"/>
                           <pic:cNvPicPr/>
                         </pic:nvPicPr>
                         <pic:blipFill>
@@ -1681,7 +1681,7 @@
                         <pic:spPr>
                           <a:xfrm>
                             <a:off x="0" y="0"/>
-                            <a:ext cx="576072" cy="146304"/>
+                            <a:ext cx="576072" cy="134112"/>
                           </a:xfrm>
                           <a:prstGeom prst="rect"/>
                         </pic:spPr>
@@ -1719,7 +1719,7 @@
             <w:r>
               <w:drawing>
                 <wp:inline xmlns:a="http://schemas.openxmlformats.org/drawingml/2006/main" xmlns:pic="http://schemas.openxmlformats.org/drawingml/2006/picture">
-                  <wp:extent cx="740664" cy="146304"/>
+                  <wp:extent cx="740664" cy="134112"/>
                   <wp:docPr id="24" name="Picture 24"/>
                   <wp:cNvGraphicFramePr>
                     <a:graphicFrameLocks noChangeAspect="1"/>
@@ -1728,7 +1728,7 @@
                     <a:graphicData uri="http://schemas.openxmlformats.org/drawingml/2006/picture">
                       <pic:pic>
                         <pic:nvPicPr>
-                          <pic:cNvPr id="0" name="2cdfdad44ff95d87.png"/>
+                          <pic:cNvPr id="0" name="3d3d99ed44045a29.png"/>
                           <pic:cNvPicPr/>
                         </pic:nvPicPr>
                         <pic:blipFill>
@@ -1740,7 +1740,7 @@
                         <pic:spPr>
                           <a:xfrm>
                             <a:off x="0" y="0"/>
-                            <a:ext cx="740664" cy="146304"/>
+                            <a:ext cx="740664" cy="134112"/>
                           </a:xfrm>
                           <a:prstGeom prst="rect"/>
                         </pic:spPr>
@@ -1778,7 +1778,7 @@
             <w:r>
               <w:drawing>
                 <wp:inline xmlns:a="http://schemas.openxmlformats.org/drawingml/2006/main" xmlns:pic="http://schemas.openxmlformats.org/drawingml/2006/picture">
-                  <wp:extent cx="576072" cy="146304"/>
+                  <wp:extent cx="576072" cy="134112"/>
                   <wp:docPr id="25" name="Picture 25"/>
                   <wp:cNvGraphicFramePr>
                     <a:graphicFrameLocks noChangeAspect="1"/>
@@ -1787,7 +1787,7 @@
                     <a:graphicData uri="http://schemas.openxmlformats.org/drawingml/2006/picture">
                       <pic:pic>
                         <pic:nvPicPr>
-                          <pic:cNvPr id="0" name="05128cdd03aebcb2.png"/>
+                          <pic:cNvPr id="0" name="3c4cb58e333ef465.png"/>
                           <pic:cNvPicPr/>
                         </pic:nvPicPr>
                         <pic:blipFill>
@@ -1799,7 +1799,7 @@
                         <pic:spPr>
                           <a:xfrm>
                             <a:off x="0" y="0"/>
-                            <a:ext cx="576072" cy="146304"/>
+                            <a:ext cx="576072" cy="134112"/>
                           </a:xfrm>
                           <a:prstGeom prst="rect"/>
                         </pic:spPr>
@@ -1912,7 +1912,7 @@
             <w:r>
               <w:drawing>
                 <wp:inline xmlns:a="http://schemas.openxmlformats.org/drawingml/2006/main" xmlns:pic="http://schemas.openxmlformats.org/drawingml/2006/picture">
-                  <wp:extent cx="451104" cy="149352"/>
+                  <wp:extent cx="445008" cy="134112"/>
                   <wp:docPr id="26" name="Picture 26"/>
                   <wp:cNvGraphicFramePr>
                     <a:graphicFrameLocks noChangeAspect="1"/>
@@ -1921,7 +1921,7 @@
                     <a:graphicData uri="http://schemas.openxmlformats.org/drawingml/2006/picture">
                       <pic:pic>
                         <pic:nvPicPr>
-                          <pic:cNvPr id="0" name="9d5a45488ba24a79.png"/>
+                          <pic:cNvPr id="0" name="35adec157b19cafc.png"/>
                           <pic:cNvPicPr/>
                         </pic:nvPicPr>
                         <pic:blipFill>
@@ -1933,7 +1933,7 @@
                         <pic:spPr>
                           <a:xfrm>
                             <a:off x="0" y="0"/>
-                            <a:ext cx="451104" cy="149352"/>
+                            <a:ext cx="445008" cy="134112"/>
                           </a:xfrm>
                           <a:prstGeom prst="rect"/>
                         </pic:spPr>
@@ -1992,7 +1992,7 @@
             <w:r>
               <w:drawing>
                 <wp:inline xmlns:a="http://schemas.openxmlformats.org/drawingml/2006/main" xmlns:pic="http://schemas.openxmlformats.org/drawingml/2006/picture">
-                  <wp:extent cx="1426464" cy="170688"/>
+                  <wp:extent cx="1402080" cy="161544"/>
                   <wp:docPr id="27" name="Picture 27"/>
                   <wp:cNvGraphicFramePr>
                     <a:graphicFrameLocks noChangeAspect="1"/>
@@ -2001,7 +2001,7 @@
                     <a:graphicData uri="http://schemas.openxmlformats.org/drawingml/2006/picture">
                       <pic:pic>
                         <pic:nvPicPr>
-                          <pic:cNvPr id="0" name="852274c218488cdc.png"/>
+                          <pic:cNvPr id="0" name="c5bd43b5fe06b9e8.png"/>
                           <pic:cNvPicPr/>
                         </pic:nvPicPr>
                         <pic:blipFill>
@@ -2013,7 +2013,7 @@
                         <pic:spPr>
                           <a:xfrm>
                             <a:off x="0" y="0"/>
-                            <a:ext cx="1426464" cy="170688"/>
+                            <a:ext cx="1402080" cy="161544"/>
                           </a:xfrm>
                           <a:prstGeom prst="rect"/>
                         </pic:spPr>
@@ -2051,7 +2051,7 @@
             <w:r>
               <w:drawing>
                 <wp:inline xmlns:a="http://schemas.openxmlformats.org/drawingml/2006/main" xmlns:pic="http://schemas.openxmlformats.org/drawingml/2006/picture">
-                  <wp:extent cx="332232" cy="252984"/>
+                  <wp:extent cx="329184" cy="234696"/>
                   <wp:docPr id="28" name="Picture 28"/>
                   <wp:cNvGraphicFramePr>
                     <a:graphicFrameLocks noChangeAspect="1"/>
@@ -2060,7 +2060,7 @@
                     <a:graphicData uri="http://schemas.openxmlformats.org/drawingml/2006/picture">
                       <pic:pic>
                         <pic:nvPicPr>
-                          <pic:cNvPr id="0" name="1e009e3e7bcf25f2.png"/>
+                          <pic:cNvPr id="0" name="0cc42106f2920108.png"/>
                           <pic:cNvPicPr/>
                         </pic:nvPicPr>
                         <pic:blipFill>
@@ -2072,7 +2072,7 @@
                         <pic:spPr>
                           <a:xfrm>
                             <a:off x="0" y="0"/>
-                            <a:ext cx="332232" cy="252984"/>
+                            <a:ext cx="329184" cy="234696"/>
                           </a:xfrm>
                           <a:prstGeom prst="rect"/>
                         </pic:spPr>
@@ -2110,7 +2110,7 @@
             <w:r>
               <w:drawing>
                 <wp:inline xmlns:a="http://schemas.openxmlformats.org/drawingml/2006/main" xmlns:pic="http://schemas.openxmlformats.org/drawingml/2006/picture">
-                  <wp:extent cx="1143000" cy="170688"/>
+                  <wp:extent cx="1133856" cy="161544"/>
                   <wp:docPr id="29" name="Picture 29"/>
                   <wp:cNvGraphicFramePr>
                     <a:graphicFrameLocks noChangeAspect="1"/>
@@ -2119,7 +2119,7 @@
                     <a:graphicData uri="http://schemas.openxmlformats.org/drawingml/2006/picture">
                       <pic:pic>
                         <pic:nvPicPr>
-                          <pic:cNvPr id="0" name="83a8b403dc62c68f.png"/>
+                          <pic:cNvPr id="0" name="e789e2a592977900.png"/>
                           <pic:cNvPicPr/>
                         </pic:nvPicPr>
                         <pic:blipFill>
@@ -2131,7 +2131,7 @@
                         <pic:spPr>
                           <a:xfrm>
                             <a:off x="0" y="0"/>
-                            <a:ext cx="1143000" cy="170688"/>
+                            <a:ext cx="1133856" cy="161544"/>
                           </a:xfrm>
                           <a:prstGeom prst="rect"/>
                         </pic:spPr>
@@ -2169,7 +2169,7 @@
             <w:r>
               <w:drawing>
                 <wp:inline xmlns:a="http://schemas.openxmlformats.org/drawingml/2006/main" xmlns:pic="http://schemas.openxmlformats.org/drawingml/2006/picture">
-                  <wp:extent cx="1551432" cy="173736"/>
+                  <wp:extent cx="1517904" cy="161544"/>
                   <wp:docPr id="30" name="Picture 30"/>
                   <wp:cNvGraphicFramePr>
                     <a:graphicFrameLocks noChangeAspect="1"/>
@@ -2178,7 +2178,7 @@
                     <a:graphicData uri="http://schemas.openxmlformats.org/drawingml/2006/picture">
                       <pic:pic>
                         <pic:nvPicPr>
-                          <pic:cNvPr id="0" name="b2aa059c87d4020f.png"/>
+                          <pic:cNvPr id="0" name="35591d3b2066fba2.png"/>
                           <pic:cNvPicPr/>
                         </pic:nvPicPr>
                         <pic:blipFill>
@@ -2190,7 +2190,7 @@
                         <pic:spPr>
                           <a:xfrm>
                             <a:off x="0" y="0"/>
-                            <a:ext cx="1551432" cy="173736"/>
+                            <a:ext cx="1517904" cy="161544"/>
                           </a:xfrm>
                           <a:prstGeom prst="rect"/>
                         </pic:spPr>
@@ -2228,7 +2228,7 @@
             <w:r>
               <w:drawing>
                 <wp:inline xmlns:a="http://schemas.openxmlformats.org/drawingml/2006/main" xmlns:pic="http://schemas.openxmlformats.org/drawingml/2006/picture">
-                  <wp:extent cx="1551432" cy="170688"/>
+                  <wp:extent cx="1517904" cy="161544"/>
                   <wp:docPr id="31" name="Picture 31"/>
                   <wp:cNvGraphicFramePr>
                     <a:graphicFrameLocks noChangeAspect="1"/>
@@ -2237,7 +2237,7 @@
                     <a:graphicData uri="http://schemas.openxmlformats.org/drawingml/2006/picture">
                       <pic:pic>
                         <pic:nvPicPr>
-                          <pic:cNvPr id="0" name="188c19acb12509be.png"/>
+                          <pic:cNvPr id="0" name="a86b6b1ebd47264b.png"/>
                           <pic:cNvPicPr/>
                         </pic:nvPicPr>
                         <pic:blipFill>
@@ -2249,7 +2249,7 @@
                         <pic:spPr>
                           <a:xfrm>
                             <a:off x="0" y="0"/>
-                            <a:ext cx="1551432" cy="170688"/>
+                            <a:ext cx="1517904" cy="161544"/>
                           </a:xfrm>
                           <a:prstGeom prst="rect"/>
                         </pic:spPr>
@@ -2287,7 +2287,7 @@
             <w:r>
               <w:drawing>
                 <wp:inline xmlns:a="http://schemas.openxmlformats.org/drawingml/2006/main" xmlns:pic="http://schemas.openxmlformats.org/drawingml/2006/picture">
-                  <wp:extent cx="332232" cy="252984"/>
+                  <wp:extent cx="326136" cy="234696"/>
                   <wp:docPr id="32" name="Picture 32"/>
                   <wp:cNvGraphicFramePr>
                     <a:graphicFrameLocks noChangeAspect="1"/>
@@ -2296,7 +2296,7 @@
                     <a:graphicData uri="http://schemas.openxmlformats.org/drawingml/2006/picture">
                       <pic:pic>
                         <pic:nvPicPr>
-                          <pic:cNvPr id="0" name="e655a37a1ecc5a75.png"/>
+                          <pic:cNvPr id="0" name="d54c346efe50606f.png"/>
                           <pic:cNvPicPr/>
                         </pic:nvPicPr>
                         <pic:blipFill>
@@ -2308,7 +2308,7 @@
                         <pic:spPr>
                           <a:xfrm>
                             <a:off x="0" y="0"/>
-                            <a:ext cx="332232" cy="252984"/>
+                            <a:ext cx="326136" cy="234696"/>
                           </a:xfrm>
                           <a:prstGeom prst="rect"/>
                         </pic:spPr>
@@ -2351,7 +2351,7 @@
             <w:r>
               <w:drawing>
                 <wp:inline xmlns:a="http://schemas.openxmlformats.org/drawingml/2006/main" xmlns:pic="http://schemas.openxmlformats.org/drawingml/2006/picture">
-                  <wp:extent cx="530352" cy="146304"/>
+                  <wp:extent cx="539496" cy="134112"/>
                   <wp:docPr id="33" name="Picture 33"/>
                   <wp:cNvGraphicFramePr>
                     <a:graphicFrameLocks noChangeAspect="1"/>
@@ -2360,7 +2360,7 @@
                     <a:graphicData uri="http://schemas.openxmlformats.org/drawingml/2006/picture">
                       <pic:pic>
                         <pic:nvPicPr>
-                          <pic:cNvPr id="0" name="bc14b47fc710fbe0.png"/>
+                          <pic:cNvPr id="0" name="c86d8d6cbbc2e1da.png"/>
                           <pic:cNvPicPr/>
                         </pic:nvPicPr>
                         <pic:blipFill>
@@ -2372,7 +2372,7 @@
                         <pic:spPr>
                           <a:xfrm>
                             <a:off x="0" y="0"/>
-                            <a:ext cx="530352" cy="146304"/>
+                            <a:ext cx="539496" cy="134112"/>
                           </a:xfrm>
                           <a:prstGeom prst="rect"/>
                         </pic:spPr>
@@ -2394,7 +2394,7 @@
             <w:r>
               <w:drawing>
                 <wp:inline xmlns:a="http://schemas.openxmlformats.org/drawingml/2006/main" xmlns:pic="http://schemas.openxmlformats.org/drawingml/2006/picture">
-                  <wp:extent cx="451104" cy="149352"/>
+                  <wp:extent cx="445008" cy="134112"/>
                   <wp:docPr id="34" name="Picture 34"/>
                   <wp:cNvGraphicFramePr>
                     <a:graphicFrameLocks noChangeAspect="1"/>
@@ -2403,7 +2403,7 @@
                     <a:graphicData uri="http://schemas.openxmlformats.org/drawingml/2006/picture">
                       <pic:pic>
                         <pic:nvPicPr>
-                          <pic:cNvPr id="0" name="e695240f046bd7b3.png"/>
+                          <pic:cNvPr id="0" name="d3009a7d9b5acafd.png"/>
                           <pic:cNvPicPr/>
                         </pic:nvPicPr>
                         <pic:blipFill>
@@ -2415,7 +2415,7 @@
                         <pic:spPr>
                           <a:xfrm>
                             <a:off x="0" y="0"/>
-                            <a:ext cx="451104" cy="149352"/>
+                            <a:ext cx="445008" cy="134112"/>
                           </a:xfrm>
                           <a:prstGeom prst="rect"/>
                         </pic:spPr>
@@ -2522,7 +2522,7 @@
             <w:r>
               <w:drawing>
                 <wp:inline xmlns:a="http://schemas.openxmlformats.org/drawingml/2006/main" xmlns:pic="http://schemas.openxmlformats.org/drawingml/2006/picture">
-                  <wp:extent cx="2356104" cy="170688"/>
+                  <wp:extent cx="2328672" cy="161544"/>
                   <wp:docPr id="35" name="Picture 35"/>
                   <wp:cNvGraphicFramePr>
                     <a:graphicFrameLocks noChangeAspect="1"/>
@@ -2531,7 +2531,7 @@
                     <a:graphicData uri="http://schemas.openxmlformats.org/drawingml/2006/picture">
                       <pic:pic>
                         <pic:nvPicPr>
-                          <pic:cNvPr id="0" name="60ff2aaaf411d565.png"/>
+                          <pic:cNvPr id="0" name="2786173dab7e2f6a.png"/>
                           <pic:cNvPicPr/>
                         </pic:nvPicPr>
                         <pic:blipFill>
@@ -2543,7 +2543,7 @@
                         <pic:spPr>
                           <a:xfrm>
                             <a:off x="0" y="0"/>
-                            <a:ext cx="2356104" cy="170688"/>
+                            <a:ext cx="2328672" cy="161544"/>
                           </a:xfrm>
                           <a:prstGeom prst="rect"/>
                         </pic:spPr>
@@ -2592,7 +2592,7 @@
             <w:r>
               <w:drawing>
                 <wp:inline xmlns:a="http://schemas.openxmlformats.org/drawingml/2006/main" xmlns:pic="http://schemas.openxmlformats.org/drawingml/2006/picture">
-                  <wp:extent cx="743712" cy="149352"/>
+                  <wp:extent cx="728472" cy="134112"/>
                   <wp:docPr id="36" name="Picture 36"/>
                   <wp:cNvGraphicFramePr>
                     <a:graphicFrameLocks noChangeAspect="1"/>
@@ -2601,7 +2601,7 @@
                     <a:graphicData uri="http://schemas.openxmlformats.org/drawingml/2006/picture">
                       <pic:pic>
                         <pic:nvPicPr>
-                          <pic:cNvPr id="0" name="817fd1c159a2380f.png"/>
+                          <pic:cNvPr id="0" name="354f48669ddabe25.png"/>
                           <pic:cNvPicPr/>
                         </pic:nvPicPr>
                         <pic:blipFill>
@@ -2613,7 +2613,7 @@
                         <pic:spPr>
                           <a:xfrm>
                             <a:off x="0" y="0"/>
-                            <a:ext cx="743712" cy="149352"/>
+                            <a:ext cx="728472" cy="134112"/>
                           </a:xfrm>
                           <a:prstGeom prst="rect"/>
                         </pic:spPr>
@@ -2650,7 +2650,7 @@
             <w:r>
               <w:drawing>
                 <wp:inline xmlns:a="http://schemas.openxmlformats.org/drawingml/2006/main" xmlns:pic="http://schemas.openxmlformats.org/drawingml/2006/picture">
-                  <wp:extent cx="1493520" cy="146304"/>
+                  <wp:extent cx="1484376" cy="134112"/>
                   <wp:docPr id="37" name="Picture 37"/>
                   <wp:cNvGraphicFramePr>
                     <a:graphicFrameLocks noChangeAspect="1"/>
@@ -2659,7 +2659,7 @@
                     <a:graphicData uri="http://schemas.openxmlformats.org/drawingml/2006/picture">
                       <pic:pic>
                         <pic:nvPicPr>
-                          <pic:cNvPr id="0" name="4dbccdcc93acc78a.png"/>
+                          <pic:cNvPr id="0" name="fd07c76256ef1795.png"/>
                           <pic:cNvPicPr/>
                         </pic:nvPicPr>
                         <pic:blipFill>
@@ -2671,7 +2671,7 @@
                         <pic:spPr>
                           <a:xfrm>
                             <a:off x="0" y="0"/>
-                            <a:ext cx="1493520" cy="146304"/>
+                            <a:ext cx="1484376" cy="134112"/>
                           </a:xfrm>
                           <a:prstGeom prst="rect"/>
                         </pic:spPr>
@@ -2778,7 +2778,7 @@
             <w:r>
               <w:drawing>
                 <wp:inline xmlns:a="http://schemas.openxmlformats.org/drawingml/2006/main" xmlns:pic="http://schemas.openxmlformats.org/drawingml/2006/picture">
-                  <wp:extent cx="454152" cy="146304"/>
+                  <wp:extent cx="454152" cy="134112"/>
                   <wp:docPr id="38" name="Picture 38"/>
                   <wp:cNvGraphicFramePr>
                     <a:graphicFrameLocks noChangeAspect="1"/>
@@ -2787,7 +2787,7 @@
                     <a:graphicData uri="http://schemas.openxmlformats.org/drawingml/2006/picture">
                       <pic:pic>
                         <pic:nvPicPr>
-                          <pic:cNvPr id="0" name="14e175409dcc5cce.png"/>
+                          <pic:cNvPr id="0" name="bbe231c69d3df169.png"/>
                           <pic:cNvPicPr/>
                         </pic:nvPicPr>
                         <pic:blipFill>
@@ -2799,7 +2799,7 @@
                         <pic:spPr>
                           <a:xfrm>
                             <a:off x="0" y="0"/>
-                            <a:ext cx="454152" cy="146304"/>
+                            <a:ext cx="454152" cy="134112"/>
                           </a:xfrm>
                           <a:prstGeom prst="rect"/>
                         </pic:spPr>
@@ -2821,7 +2821,7 @@
             <w:r>
               <w:drawing>
                 <wp:inline xmlns:a="http://schemas.openxmlformats.org/drawingml/2006/main" xmlns:pic="http://schemas.openxmlformats.org/drawingml/2006/picture">
-                  <wp:extent cx="524256" cy="146304"/>
+                  <wp:extent cx="499871" cy="134112"/>
                   <wp:docPr id="39" name="Picture 39"/>
                   <wp:cNvGraphicFramePr>
                     <a:graphicFrameLocks noChangeAspect="1"/>
@@ -2830,7 +2830,7 @@
                     <a:graphicData uri="http://schemas.openxmlformats.org/drawingml/2006/picture">
                       <pic:pic>
                         <pic:nvPicPr>
-                          <pic:cNvPr id="0" name="9069f5b3632a6f53.png"/>
+                          <pic:cNvPr id="0" name="ec3d15dc99fe313b.png"/>
                           <pic:cNvPicPr/>
                         </pic:nvPicPr>
                         <pic:blipFill>
@@ -2842,7 +2842,7 @@
                         <pic:spPr>
                           <a:xfrm>
                             <a:off x="0" y="0"/>
-                            <a:ext cx="524256" cy="146304"/>
+                            <a:ext cx="499871" cy="134112"/>
                           </a:xfrm>
                           <a:prstGeom prst="rect"/>
                         </pic:spPr>
@@ -2882,7 +2882,7 @@
             <w:r>
               <w:drawing>
                 <wp:inline xmlns:a="http://schemas.openxmlformats.org/drawingml/2006/main" xmlns:pic="http://schemas.openxmlformats.org/drawingml/2006/picture">
-                  <wp:extent cx="530352" cy="146304"/>
+                  <wp:extent cx="512064" cy="134112"/>
                   <wp:docPr id="40" name="Picture 40"/>
                   <wp:cNvGraphicFramePr>
                     <a:graphicFrameLocks noChangeAspect="1"/>
@@ -2891,7 +2891,7 @@
                     <a:graphicData uri="http://schemas.openxmlformats.org/drawingml/2006/picture">
                       <pic:pic>
                         <pic:nvPicPr>
-                          <pic:cNvPr id="0" name="5e44080ae6153967.png"/>
+                          <pic:cNvPr id="0" name="797cd1a63106567f.png"/>
                           <pic:cNvPicPr/>
                         </pic:nvPicPr>
                         <pic:blipFill>
@@ -2903,7 +2903,7 @@
                         <pic:spPr>
                           <a:xfrm>
                             <a:off x="0" y="0"/>
-                            <a:ext cx="530352" cy="146304"/>
+                            <a:ext cx="512064" cy="134112"/>
                           </a:xfrm>
                           <a:prstGeom prst="rect"/>
                         </pic:spPr>
@@ -2922,7 +2922,7 @@
             <w:r>
               <w:drawing>
                 <wp:inline xmlns:a="http://schemas.openxmlformats.org/drawingml/2006/main" xmlns:pic="http://schemas.openxmlformats.org/drawingml/2006/picture">
-                  <wp:extent cx="1929384" cy="256032"/>
+                  <wp:extent cx="1853184" cy="234696"/>
                   <wp:docPr id="41" name="Picture 41"/>
                   <wp:cNvGraphicFramePr>
                     <a:graphicFrameLocks noChangeAspect="1"/>
@@ -2931,7 +2931,7 @@
                     <a:graphicData uri="http://schemas.openxmlformats.org/drawingml/2006/picture">
                       <pic:pic>
                         <pic:nvPicPr>
-                          <pic:cNvPr id="0" name="54fb981cb0e39517.png"/>
+                          <pic:cNvPr id="0" name="a1f71bd76be634d3.png"/>
                           <pic:cNvPicPr/>
                         </pic:nvPicPr>
                         <pic:blipFill>
@@ -2943,7 +2943,7 @@
                         <pic:spPr>
                           <a:xfrm>
                             <a:off x="0" y="0"/>
-                            <a:ext cx="1929384" cy="256032"/>
+                            <a:ext cx="1853184" cy="234696"/>
                           </a:xfrm>
                           <a:prstGeom prst="rect"/>
                         </pic:spPr>
@@ -2965,7 +2965,7 @@
             <w:r>
               <w:drawing>
                 <wp:inline xmlns:a="http://schemas.openxmlformats.org/drawingml/2006/main" xmlns:pic="http://schemas.openxmlformats.org/drawingml/2006/picture">
-                  <wp:extent cx="655320" cy="146304"/>
+                  <wp:extent cx="649224" cy="134112"/>
                   <wp:docPr id="42" name="Picture 42"/>
                   <wp:cNvGraphicFramePr>
                     <a:graphicFrameLocks noChangeAspect="1"/>
@@ -2974,7 +2974,7 @@
                     <a:graphicData uri="http://schemas.openxmlformats.org/drawingml/2006/picture">
                       <pic:pic>
                         <pic:nvPicPr>
-                          <pic:cNvPr id="0" name="6a2933ea5b828c7a.png"/>
+                          <pic:cNvPr id="0" name="a6ef45bdb202d21b.png"/>
                           <pic:cNvPicPr/>
                         </pic:nvPicPr>
                         <pic:blipFill>
@@ -2986,7 +2986,7 @@
                         <pic:spPr>
                           <a:xfrm>
                             <a:off x="0" y="0"/>
-                            <a:ext cx="655320" cy="146304"/>
+                            <a:ext cx="649224" cy="134112"/>
                           </a:xfrm>
                           <a:prstGeom prst="rect"/>
                         </pic:spPr>
@@ -3448,7 +3448,7 @@
             <w:r>
               <w:drawing>
                 <wp:inline xmlns:a="http://schemas.openxmlformats.org/drawingml/2006/main" xmlns:pic="http://schemas.openxmlformats.org/drawingml/2006/picture">
-                  <wp:extent cx="576072" cy="146304"/>
+                  <wp:extent cx="576072" cy="134112"/>
                   <wp:docPr id="43" name="Picture 43"/>
                   <wp:cNvGraphicFramePr>
                     <a:graphicFrameLocks noChangeAspect="1"/>
@@ -3457,7 +3457,7 @@
                     <a:graphicData uri="http://schemas.openxmlformats.org/drawingml/2006/picture">
                       <pic:pic>
                         <pic:nvPicPr>
-                          <pic:cNvPr id="0" name="ab44ffff6abf51b5.png"/>
+                          <pic:cNvPr id="0" name="db8ba3d4ccdde9b7.png"/>
                           <pic:cNvPicPr/>
                         </pic:nvPicPr>
                         <pic:blipFill>
@@ -3469,7 +3469,7 @@
                         <pic:spPr>
                           <a:xfrm>
                             <a:off x="0" y="0"/>
-                            <a:ext cx="576072" cy="146304"/>
+                            <a:ext cx="576072" cy="134112"/>
                           </a:xfrm>
                           <a:prstGeom prst="rect"/>
                         </pic:spPr>
@@ -3491,7 +3491,7 @@
             <w:r>
               <w:drawing>
                 <wp:inline xmlns:a="http://schemas.openxmlformats.org/drawingml/2006/main" xmlns:pic="http://schemas.openxmlformats.org/drawingml/2006/picture">
-                  <wp:extent cx="643128" cy="146304"/>
+                  <wp:extent cx="637032" cy="134112"/>
                   <wp:docPr id="44" name="Picture 44"/>
                   <wp:cNvGraphicFramePr>
                     <a:graphicFrameLocks noChangeAspect="1"/>
@@ -3500,7 +3500,7 @@
                     <a:graphicData uri="http://schemas.openxmlformats.org/drawingml/2006/picture">
                       <pic:pic>
                         <pic:nvPicPr>
-                          <pic:cNvPr id="0" name="db77aef28191b26a.png"/>
+                          <pic:cNvPr id="0" name="8bbcec85f013a949.png"/>
                           <pic:cNvPicPr/>
                         </pic:nvPicPr>
                         <pic:blipFill>
@@ -3512,7 +3512,7 @@
                         <pic:spPr>
                           <a:xfrm>
                             <a:off x="0" y="0"/>
-                            <a:ext cx="643128" cy="146304"/>
+                            <a:ext cx="637032" cy="134112"/>
                           </a:xfrm>
                           <a:prstGeom prst="rect"/>
                         </pic:spPr>
@@ -3552,7 +3552,7 @@
             <w:r>
               <w:drawing>
                 <wp:inline xmlns:a="http://schemas.openxmlformats.org/drawingml/2006/main" xmlns:pic="http://schemas.openxmlformats.org/drawingml/2006/picture">
-                  <wp:extent cx="573024" cy="146304"/>
+                  <wp:extent cx="573024" cy="134112"/>
                   <wp:docPr id="45" name="Picture 45"/>
                   <wp:cNvGraphicFramePr>
                     <a:graphicFrameLocks noChangeAspect="1"/>
@@ -3561,7 +3561,7 @@
                     <a:graphicData uri="http://schemas.openxmlformats.org/drawingml/2006/picture">
                       <pic:pic>
                         <pic:nvPicPr>
-                          <pic:cNvPr id="0" name="a80fe8caefc0c187.png"/>
+                          <pic:cNvPr id="0" name="f6ea23b13b181ecd.png"/>
                           <pic:cNvPicPr/>
                         </pic:nvPicPr>
                         <pic:blipFill>
@@ -3573,7 +3573,7 @@
                         <pic:spPr>
                           <a:xfrm>
                             <a:off x="0" y="0"/>
-                            <a:ext cx="573024" cy="146304"/>
+                            <a:ext cx="573024" cy="134112"/>
                           </a:xfrm>
                           <a:prstGeom prst="rect"/>
                         </pic:spPr>
@@ -3637,7 +3637,7 @@
             <w:r>
               <w:drawing>
                 <wp:inline xmlns:a="http://schemas.openxmlformats.org/drawingml/2006/main" xmlns:pic="http://schemas.openxmlformats.org/drawingml/2006/picture">
-                  <wp:extent cx="658368" cy="146304"/>
+                  <wp:extent cx="664464" cy="134112"/>
                   <wp:docPr id="46" name="Picture 46"/>
                   <wp:cNvGraphicFramePr>
                     <a:graphicFrameLocks noChangeAspect="1"/>
@@ -3646,7 +3646,7 @@
                     <a:graphicData uri="http://schemas.openxmlformats.org/drawingml/2006/picture">
                       <pic:pic>
                         <pic:nvPicPr>
-                          <pic:cNvPr id="0" name="6d1dcc83790b5e5a.png"/>
+                          <pic:cNvPr id="0" name="abb6c0d9bd9b85d0.png"/>
                           <pic:cNvPicPr/>
                         </pic:nvPicPr>
                         <pic:blipFill>
@@ -3658,7 +3658,7 @@
                         <pic:spPr>
                           <a:xfrm>
                             <a:off x="0" y="0"/>
-                            <a:ext cx="658368" cy="146304"/>
+                            <a:ext cx="664464" cy="134112"/>
                           </a:xfrm>
                           <a:prstGeom prst="rect"/>
                         </pic:spPr>
@@ -3698,7 +3698,7 @@
             <w:r>
               <w:drawing>
                 <wp:inline xmlns:a="http://schemas.openxmlformats.org/drawingml/2006/main" xmlns:pic="http://schemas.openxmlformats.org/drawingml/2006/picture">
-                  <wp:extent cx="566928" cy="146304"/>
+                  <wp:extent cx="560832" cy="134112"/>
                   <wp:docPr id="47" name="Picture 47"/>
                   <wp:cNvGraphicFramePr>
                     <a:graphicFrameLocks noChangeAspect="1"/>
@@ -3707,7 +3707,7 @@
                     <a:graphicData uri="http://schemas.openxmlformats.org/drawingml/2006/picture">
                       <pic:pic>
                         <pic:nvPicPr>
-                          <pic:cNvPr id="0" name="ddf10ca4ea3b54bd.png"/>
+                          <pic:cNvPr id="0" name="dad5564cea477dc2.png"/>
                           <pic:cNvPicPr/>
                         </pic:nvPicPr>
                         <pic:blipFill>
@@ -3719,7 +3719,7 @@
                         <pic:spPr>
                           <a:xfrm>
                             <a:off x="0" y="0"/>
-                            <a:ext cx="566928" cy="146304"/>
+                            <a:ext cx="560832" cy="134112"/>
                           </a:xfrm>
                           <a:prstGeom prst="rect"/>
                         </pic:spPr>
@@ -3865,7 +3865,7 @@
             <w:r>
               <w:drawing>
                 <wp:inline xmlns:a="http://schemas.openxmlformats.org/drawingml/2006/main" xmlns:pic="http://schemas.openxmlformats.org/drawingml/2006/picture">
-                  <wp:extent cx="655320" cy="146304"/>
+                  <wp:extent cx="652272" cy="134112"/>
                   <wp:docPr id="48" name="Picture 48"/>
                   <wp:cNvGraphicFramePr>
                     <a:graphicFrameLocks noChangeAspect="1"/>
@@ -3874,7 +3874,7 @@
                     <a:graphicData uri="http://schemas.openxmlformats.org/drawingml/2006/picture">
                       <pic:pic>
                         <pic:nvPicPr>
-                          <pic:cNvPr id="0" name="2ff8578e6f6a7828.png"/>
+                          <pic:cNvPr id="0" name="a49acf5d5cbf9292.png"/>
                           <pic:cNvPicPr/>
                         </pic:nvPicPr>
                         <pic:blipFill>
@@ -3886,7 +3886,7 @@
                         <pic:spPr>
                           <a:xfrm>
                             <a:off x="0" y="0"/>
-                            <a:ext cx="655320" cy="146304"/>
+                            <a:ext cx="652272" cy="134112"/>
                           </a:xfrm>
                           <a:prstGeom prst="rect"/>
                         </pic:spPr>
@@ -3908,7 +3908,7 @@
             <w:r>
               <w:drawing>
                 <wp:inline xmlns:a="http://schemas.openxmlformats.org/drawingml/2006/main" xmlns:pic="http://schemas.openxmlformats.org/drawingml/2006/picture">
-                  <wp:extent cx="579120" cy="146304"/>
+                  <wp:extent cx="573024" cy="134112"/>
                   <wp:docPr id="49" name="Picture 49"/>
                   <wp:cNvGraphicFramePr>
                     <a:graphicFrameLocks noChangeAspect="1"/>
@@ -3917,7 +3917,7 @@
                     <a:graphicData uri="http://schemas.openxmlformats.org/drawingml/2006/picture">
                       <pic:pic>
                         <pic:nvPicPr>
-                          <pic:cNvPr id="0" name="feb71ad60b7eed5f.png"/>
+                          <pic:cNvPr id="0" name="fcb63df97fbd41d8.png"/>
                           <pic:cNvPicPr/>
                         </pic:nvPicPr>
                         <pic:blipFill>
@@ -3929,7 +3929,7 @@
                         <pic:spPr>
                           <a:xfrm>
                             <a:off x="0" y="0"/>
-                            <a:ext cx="579120" cy="146304"/>
+                            <a:ext cx="573024" cy="134112"/>
                           </a:xfrm>
                           <a:prstGeom prst="rect"/>
                         </pic:spPr>
@@ -3969,7 +3969,7 @@
             <w:r>
               <w:drawing>
                 <wp:inline xmlns:a="http://schemas.openxmlformats.org/drawingml/2006/main" xmlns:pic="http://schemas.openxmlformats.org/drawingml/2006/picture">
-                  <wp:extent cx="655320" cy="146304"/>
+                  <wp:extent cx="652272" cy="134112"/>
                   <wp:docPr id="50" name="Picture 50"/>
                   <wp:cNvGraphicFramePr>
                     <a:graphicFrameLocks noChangeAspect="1"/>
@@ -3978,7 +3978,7 @@
                     <a:graphicData uri="http://schemas.openxmlformats.org/drawingml/2006/picture">
                       <pic:pic>
                         <pic:nvPicPr>
-                          <pic:cNvPr id="0" name="665dacad76726c7b.png"/>
+                          <pic:cNvPr id="0" name="d5e6be3ba62a8f28.png"/>
                           <pic:cNvPicPr/>
                         </pic:nvPicPr>
                         <pic:blipFill>
@@ -3990,7 +3990,7 @@
                         <pic:spPr>
                           <a:xfrm>
                             <a:off x="0" y="0"/>
-                            <a:ext cx="655320" cy="146304"/>
+                            <a:ext cx="652272" cy="134112"/>
                           </a:xfrm>
                           <a:prstGeom prst="rect"/>
                         </pic:spPr>
@@ -4054,7 +4054,7 @@
             <w:r>
               <w:drawing>
                 <wp:inline xmlns:a="http://schemas.openxmlformats.org/drawingml/2006/main" xmlns:pic="http://schemas.openxmlformats.org/drawingml/2006/picture">
-                  <wp:extent cx="737616" cy="146304"/>
+                  <wp:extent cx="725424" cy="134112"/>
                   <wp:docPr id="51" name="Picture 51"/>
                   <wp:cNvGraphicFramePr>
                     <a:graphicFrameLocks noChangeAspect="1"/>
@@ -4063,7 +4063,7 @@
                     <a:graphicData uri="http://schemas.openxmlformats.org/drawingml/2006/picture">
                       <pic:pic>
                         <pic:nvPicPr>
-                          <pic:cNvPr id="0" name="ef87de1e8efada34.png"/>
+                          <pic:cNvPr id="0" name="ae8a48805987981e.png"/>
                           <pic:cNvPicPr/>
                         </pic:nvPicPr>
                         <pic:blipFill>
@@ -4075,7 +4075,7 @@
                         <pic:spPr>
                           <a:xfrm>
                             <a:off x="0" y="0"/>
-                            <a:ext cx="737616" cy="146304"/>
+                            <a:ext cx="725424" cy="134112"/>
                           </a:xfrm>
                           <a:prstGeom prst="rect"/>
                         </pic:spPr>
@@ -4097,7 +4097,7 @@
             <w:r>
               <w:drawing>
                 <wp:inline xmlns:a="http://schemas.openxmlformats.org/drawingml/2006/main" xmlns:pic="http://schemas.openxmlformats.org/drawingml/2006/picture">
-                  <wp:extent cx="737616" cy="146304"/>
+                  <wp:extent cx="725424" cy="134112"/>
                   <wp:docPr id="52" name="Picture 52"/>
                   <wp:cNvGraphicFramePr>
                     <a:graphicFrameLocks noChangeAspect="1"/>
@@ -4106,7 +4106,7 @@
                     <a:graphicData uri="http://schemas.openxmlformats.org/drawingml/2006/picture">
                       <pic:pic>
                         <pic:nvPicPr>
-                          <pic:cNvPr id="0" name="86d923b29b6a0120.png"/>
+                          <pic:cNvPr id="0" name="c8adcbc3a924bbcd.png"/>
                           <pic:cNvPicPr/>
                         </pic:nvPicPr>
                         <pic:blipFill>
@@ -4118,7 +4118,7 @@
                         <pic:spPr>
                           <a:xfrm>
                             <a:off x="0" y="0"/>
-                            <a:ext cx="737616" cy="146304"/>
+                            <a:ext cx="725424" cy="134112"/>
                           </a:xfrm>
                           <a:prstGeom prst="rect"/>
                         </pic:spPr>
@@ -4158,7 +4158,7 @@
             <w:r>
               <w:drawing>
                 <wp:inline xmlns:a="http://schemas.openxmlformats.org/drawingml/2006/main" xmlns:pic="http://schemas.openxmlformats.org/drawingml/2006/picture">
-                  <wp:extent cx="731520" cy="146304"/>
+                  <wp:extent cx="722376" cy="134112"/>
                   <wp:docPr id="53" name="Picture 53"/>
                   <wp:cNvGraphicFramePr>
                     <a:graphicFrameLocks noChangeAspect="1"/>
@@ -4167,7 +4167,7 @@
                     <a:graphicData uri="http://schemas.openxmlformats.org/drawingml/2006/picture">
                       <pic:pic>
                         <pic:nvPicPr>
-                          <pic:cNvPr id="0" name="0a1cf0c489a8aced.png"/>
+                          <pic:cNvPr id="0" name="389ea9d7f695d768.png"/>
                           <pic:cNvPicPr/>
                         </pic:nvPicPr>
                         <pic:blipFill>
@@ -4179,7 +4179,7 @@
                         <pic:spPr>
                           <a:xfrm>
                             <a:off x="0" y="0"/>
-                            <a:ext cx="731520" cy="146304"/>
+                            <a:ext cx="722376" cy="134112"/>
                           </a:xfrm>
                           <a:prstGeom prst="rect"/>
                         </pic:spPr>
@@ -4301,7 +4301,7 @@
             <w:r>
               <w:drawing>
                 <wp:inline xmlns:a="http://schemas.openxmlformats.org/drawingml/2006/main" xmlns:pic="http://schemas.openxmlformats.org/drawingml/2006/picture">
-                  <wp:extent cx="576072" cy="146304"/>
+                  <wp:extent cx="579120" cy="134112"/>
                   <wp:docPr id="54" name="Picture 54"/>
                   <wp:cNvGraphicFramePr>
                     <a:graphicFrameLocks noChangeAspect="1"/>
@@ -4310,7 +4310,7 @@
                     <a:graphicData uri="http://schemas.openxmlformats.org/drawingml/2006/picture">
                       <pic:pic>
                         <pic:nvPicPr>
-                          <pic:cNvPr id="0" name="cd94f213a5a6822f.png"/>
+                          <pic:cNvPr id="0" name="6527de3d70ddc2c9.png"/>
                           <pic:cNvPicPr/>
                         </pic:nvPicPr>
                         <pic:blipFill>
@@ -4322,7 +4322,7 @@
                         <pic:spPr>
                           <a:xfrm>
                             <a:off x="0" y="0"/>
-                            <a:ext cx="576072" cy="146304"/>
+                            <a:ext cx="579120" cy="134112"/>
                           </a:xfrm>
                           <a:prstGeom prst="rect"/>
                         </pic:spPr>
@@ -4371,7 +4371,7 @@
             <w:r>
               <w:drawing>
                 <wp:inline xmlns:a="http://schemas.openxmlformats.org/drawingml/2006/main" xmlns:pic="http://schemas.openxmlformats.org/drawingml/2006/picture">
-                  <wp:extent cx="658368" cy="146304"/>
+                  <wp:extent cx="667512" cy="134112"/>
                   <wp:docPr id="55" name="Picture 55"/>
                   <wp:cNvGraphicFramePr>
                     <a:graphicFrameLocks noChangeAspect="1"/>
@@ -4380,7 +4380,7 @@
                     <a:graphicData uri="http://schemas.openxmlformats.org/drawingml/2006/picture">
                       <pic:pic>
                         <pic:nvPicPr>
-                          <pic:cNvPr id="0" name="57b1b311f0b9b7f2.png"/>
+                          <pic:cNvPr id="0" name="a15f35ff044771f8.png"/>
                           <pic:cNvPicPr/>
                         </pic:nvPicPr>
                         <pic:blipFill>
@@ -4392,7 +4392,7 @@
                         <pic:spPr>
                           <a:xfrm>
                             <a:off x="0" y="0"/>
-                            <a:ext cx="658368" cy="146304"/>
+                            <a:ext cx="667512" cy="134112"/>
                           </a:xfrm>
                           <a:prstGeom prst="rect"/>
                         </pic:spPr>
@@ -4514,7 +4514,7 @@
             <w:r>
               <w:drawing>
                 <wp:inline xmlns:a="http://schemas.openxmlformats.org/drawingml/2006/main" xmlns:pic="http://schemas.openxmlformats.org/drawingml/2006/picture">
-                  <wp:extent cx="560832" cy="146304"/>
+                  <wp:extent cx="569976" cy="134112"/>
                   <wp:docPr id="56" name="Picture 56"/>
                   <wp:cNvGraphicFramePr>
                     <a:graphicFrameLocks noChangeAspect="1"/>
@@ -4523,7 +4523,7 @@
                     <a:graphicData uri="http://schemas.openxmlformats.org/drawingml/2006/picture">
                       <pic:pic>
                         <pic:nvPicPr>
-                          <pic:cNvPr id="0" name="32111b919c7b7a74.png"/>
+                          <pic:cNvPr id="0" name="c41c1f13e3d48378.png"/>
                           <pic:cNvPicPr/>
                         </pic:nvPicPr>
                         <pic:blipFill>
@@ -4535,7 +4535,7 @@
                         <pic:spPr>
                           <a:xfrm>
                             <a:off x="0" y="0"/>
-                            <a:ext cx="560832" cy="146304"/>
+                            <a:ext cx="569976" cy="134112"/>
                           </a:xfrm>
                           <a:prstGeom prst="rect"/>
                         </pic:spPr>
@@ -4557,7 +4557,7 @@
             <w:r>
               <w:drawing>
                 <wp:inline xmlns:a="http://schemas.openxmlformats.org/drawingml/2006/main" xmlns:pic="http://schemas.openxmlformats.org/drawingml/2006/picture">
-                  <wp:extent cx="646176" cy="146304"/>
+                  <wp:extent cx="637032" cy="134112"/>
                   <wp:docPr id="57" name="Picture 57"/>
                   <wp:cNvGraphicFramePr>
                     <a:graphicFrameLocks noChangeAspect="1"/>
@@ -4566,7 +4566,7 @@
                     <a:graphicData uri="http://schemas.openxmlformats.org/drawingml/2006/picture">
                       <pic:pic>
                         <pic:nvPicPr>
-                          <pic:cNvPr id="0" name="e631e401ee526404.png"/>
+                          <pic:cNvPr id="0" name="f4c1b95e161b338f.png"/>
                           <pic:cNvPicPr/>
                         </pic:nvPicPr>
                         <pic:blipFill>
@@ -4578,7 +4578,7 @@
                         <pic:spPr>
                           <a:xfrm>
                             <a:off x="0" y="0"/>
-                            <a:ext cx="646176" cy="146304"/>
+                            <a:ext cx="637032" cy="134112"/>
                           </a:xfrm>
                           <a:prstGeom prst="rect"/>
                         </pic:spPr>
@@ -4637,7 +4637,7 @@
             <w:r>
               <w:drawing>
                 <wp:inline xmlns:a="http://schemas.openxmlformats.org/drawingml/2006/main" xmlns:pic="http://schemas.openxmlformats.org/drawingml/2006/picture">
-                  <wp:extent cx="573024" cy="146304"/>
+                  <wp:extent cx="566928" cy="134112"/>
                   <wp:docPr id="58" name="Picture 58"/>
                   <wp:cNvGraphicFramePr>
                     <a:graphicFrameLocks noChangeAspect="1"/>
@@ -4646,7 +4646,7 @@
                     <a:graphicData uri="http://schemas.openxmlformats.org/drawingml/2006/picture">
                       <pic:pic>
                         <pic:nvPicPr>
-                          <pic:cNvPr id="0" name="02a8bf85dc3cd4e2.png"/>
+                          <pic:cNvPr id="0" name="5154c2a1f8b45e75.png"/>
                           <pic:cNvPicPr/>
                         </pic:nvPicPr>
                         <pic:blipFill>
@@ -4658,7 +4658,7 @@
                         <pic:spPr>
                           <a:xfrm>
                             <a:off x="0" y="0"/>
-                            <a:ext cx="573024" cy="146304"/>
+                            <a:ext cx="566928" cy="134112"/>
                           </a:xfrm>
                           <a:prstGeom prst="rect"/>
                         </pic:spPr>
@@ -4715,7 +4715,7 @@
             <w:r>
               <w:drawing>
                 <wp:inline xmlns:a="http://schemas.openxmlformats.org/drawingml/2006/main" xmlns:pic="http://schemas.openxmlformats.org/drawingml/2006/picture">
-                  <wp:extent cx="655320" cy="146304"/>
+                  <wp:extent cx="652272" cy="134112"/>
                   <wp:docPr id="59" name="Picture 59"/>
                   <wp:cNvGraphicFramePr>
                     <a:graphicFrameLocks noChangeAspect="1"/>
@@ -4724,7 +4724,7 @@
                     <a:graphicData uri="http://schemas.openxmlformats.org/drawingml/2006/picture">
                       <pic:pic>
                         <pic:nvPicPr>
-                          <pic:cNvPr id="0" name="7455e0dd98c7dc85.png"/>
+                          <pic:cNvPr id="0" name="9cfb17aafc5c8097.png"/>
                           <pic:cNvPicPr/>
                         </pic:nvPicPr>
                         <pic:blipFill>
@@ -4736,7 +4736,7 @@
                         <pic:spPr>
                           <a:xfrm>
                             <a:off x="0" y="0"/>
-                            <a:ext cx="655320" cy="146304"/>
+                            <a:ext cx="652272" cy="134112"/>
                           </a:xfrm>
                           <a:prstGeom prst="rect"/>
                         </pic:spPr>
@@ -4793,7 +4793,7 @@
             <w:r>
               <w:drawing>
                 <wp:inline xmlns:a="http://schemas.openxmlformats.org/drawingml/2006/main" xmlns:pic="http://schemas.openxmlformats.org/drawingml/2006/picture">
-                  <wp:extent cx="576072" cy="146304"/>
+                  <wp:extent cx="569976" cy="134112"/>
                   <wp:docPr id="60" name="Picture 60"/>
                   <wp:cNvGraphicFramePr>
                     <a:graphicFrameLocks noChangeAspect="1"/>
@@ -4802,7 +4802,7 @@
                     <a:graphicData uri="http://schemas.openxmlformats.org/drawingml/2006/picture">
                       <pic:pic>
                         <pic:nvPicPr>
-                          <pic:cNvPr id="0" name="e9ae9a05f5498808.png"/>
+                          <pic:cNvPr id="0" name="c5e83d3a12ca6cf0.png"/>
                           <pic:cNvPicPr/>
                         </pic:nvPicPr>
                         <pic:blipFill>
@@ -4814,7 +4814,7 @@
                         <pic:spPr>
                           <a:xfrm>
                             <a:off x="0" y="0"/>
-                            <a:ext cx="576072" cy="146304"/>
+                            <a:ext cx="569976" cy="134112"/>
                           </a:xfrm>
                           <a:prstGeom prst="rect"/>
                         </pic:spPr>
@@ -4871,7 +4871,7 @@
             <w:r>
               <w:drawing>
                 <wp:inline xmlns:a="http://schemas.openxmlformats.org/drawingml/2006/main" xmlns:pic="http://schemas.openxmlformats.org/drawingml/2006/picture">
-                  <wp:extent cx="658368" cy="146304"/>
+                  <wp:extent cx="655320" cy="134112"/>
                   <wp:docPr id="61" name="Picture 61"/>
                   <wp:cNvGraphicFramePr>
                     <a:graphicFrameLocks noChangeAspect="1"/>
@@ -4880,7 +4880,7 @@
                     <a:graphicData uri="http://schemas.openxmlformats.org/drawingml/2006/picture">
                       <pic:pic>
                         <pic:nvPicPr>
-                          <pic:cNvPr id="0" name="d2d75e2ed83525ca.png"/>
+                          <pic:cNvPr id="0" name="470af273c8854be4.png"/>
                           <pic:cNvPicPr/>
                         </pic:nvPicPr>
                         <pic:blipFill>
@@ -4892,7 +4892,7 @@
                         <pic:spPr>
                           <a:xfrm>
                             <a:off x="0" y="0"/>
-                            <a:ext cx="658368" cy="146304"/>
+                            <a:ext cx="655320" cy="134112"/>
                           </a:xfrm>
                           <a:prstGeom prst="rect"/>
                         </pic:spPr>
@@ -5072,7 +5072,7 @@
             <w:r>
               <w:drawing>
                 <wp:inline xmlns:a="http://schemas.openxmlformats.org/drawingml/2006/main" xmlns:pic="http://schemas.openxmlformats.org/drawingml/2006/picture">
-                  <wp:extent cx="621792" cy="143256"/>
+                  <wp:extent cx="624840" cy="134112"/>
                   <wp:docPr id="62" name="Picture 62"/>
                   <wp:cNvGraphicFramePr>
                     <a:graphicFrameLocks noChangeAspect="1"/>
@@ -5081,7 +5081,7 @@
                     <a:graphicData uri="http://schemas.openxmlformats.org/drawingml/2006/picture">
                       <pic:pic>
                         <pic:nvPicPr>
-                          <pic:cNvPr id="0" name="5757f2efd208a5ad.png"/>
+                          <pic:cNvPr id="0" name="dc5572137bea57aa.png"/>
                           <pic:cNvPicPr/>
                         </pic:nvPicPr>
                         <pic:blipFill>
@@ -5093,7 +5093,7 @@
                         <pic:spPr>
                           <a:xfrm>
                             <a:off x="0" y="0"/>
-                            <a:ext cx="621792" cy="143256"/>
+                            <a:ext cx="624840" cy="134112"/>
                           </a:xfrm>
                           <a:prstGeom prst="rect"/>
                         </pic:spPr>
@@ -5166,7 +5166,7 @@
             <w:r>
               <w:drawing>
                 <wp:inline xmlns:a="http://schemas.openxmlformats.org/drawingml/2006/main" xmlns:pic="http://schemas.openxmlformats.org/drawingml/2006/picture">
-                  <wp:extent cx="280416" cy="249935"/>
+                  <wp:extent cx="277368" cy="234696"/>
                   <wp:docPr id="63" name="Picture 63"/>
                   <wp:cNvGraphicFramePr>
                     <a:graphicFrameLocks noChangeAspect="1"/>
@@ -5175,7 +5175,7 @@
                     <a:graphicData uri="http://schemas.openxmlformats.org/drawingml/2006/picture">
                       <pic:pic>
                         <pic:nvPicPr>
-                          <pic:cNvPr id="0" name="8e7e5d1f064c90c1.png"/>
+                          <pic:cNvPr id="0" name="b2dce40f6bfd316f.png"/>
                           <pic:cNvPicPr/>
                         </pic:nvPicPr>
                         <pic:blipFill>
@@ -5187,7 +5187,7 @@
                         <pic:spPr>
                           <a:xfrm>
                             <a:off x="0" y="0"/>
-                            <a:ext cx="280416" cy="249935"/>
+                            <a:ext cx="277368" cy="234696"/>
                           </a:xfrm>
                           <a:prstGeom prst="rect"/>
                         </pic:spPr>
@@ -5260,7 +5260,7 @@
             <w:r>
               <w:drawing>
                 <wp:inline xmlns:a="http://schemas.openxmlformats.org/drawingml/2006/main" xmlns:pic="http://schemas.openxmlformats.org/drawingml/2006/picture">
-                  <wp:extent cx="548640" cy="118872"/>
+                  <wp:extent cx="588264" cy="112776"/>
                   <wp:docPr id="64" name="Picture 64"/>
                   <wp:cNvGraphicFramePr>
                     <a:graphicFrameLocks noChangeAspect="1"/>
@@ -5269,7 +5269,7 @@
                     <a:graphicData uri="http://schemas.openxmlformats.org/drawingml/2006/picture">
                       <pic:pic>
                         <pic:nvPicPr>
-                          <pic:cNvPr id="0" name="4ad07372846bd438.png"/>
+                          <pic:cNvPr id="0" name="abd39adf349fdca2.png"/>
                           <pic:cNvPicPr/>
                         </pic:nvPicPr>
                         <pic:blipFill>
@@ -5281,7 +5281,7 @@
                         <pic:spPr>
                           <a:xfrm>
                             <a:off x="0" y="0"/>
-                            <a:ext cx="548640" cy="118872"/>
+                            <a:ext cx="588264" cy="112776"/>
                           </a:xfrm>
                           <a:prstGeom prst="rect"/>
                         </pic:spPr>
@@ -5354,7 +5354,7 @@
             <w:r>
               <w:drawing>
                 <wp:inline xmlns:a="http://schemas.openxmlformats.org/drawingml/2006/main" xmlns:pic="http://schemas.openxmlformats.org/drawingml/2006/picture">
-                  <wp:extent cx="777240" cy="170688"/>
+                  <wp:extent cx="758952" cy="161544"/>
                   <wp:docPr id="65" name="Picture 65"/>
                   <wp:cNvGraphicFramePr>
                     <a:graphicFrameLocks noChangeAspect="1"/>
@@ -5363,7 +5363,7 @@
                     <a:graphicData uri="http://schemas.openxmlformats.org/drawingml/2006/picture">
                       <pic:pic>
                         <pic:nvPicPr>
-                          <pic:cNvPr id="0" name="3401e25ef5ce5792.png"/>
+                          <pic:cNvPr id="0" name="aa6bcf5d74a8007a.png"/>
                           <pic:cNvPicPr/>
                         </pic:nvPicPr>
                         <pic:blipFill>
@@ -5375,7 +5375,7 @@
                         <pic:spPr>
                           <a:xfrm>
                             <a:off x="0" y="0"/>
-                            <a:ext cx="777240" cy="170688"/>
+                            <a:ext cx="758952" cy="161544"/>
                           </a:xfrm>
                           <a:prstGeom prst="rect"/>
                         </pic:spPr>
@@ -5530,7 +5530,7 @@
             <w:r>
               <w:drawing>
                 <wp:inline xmlns:a="http://schemas.openxmlformats.org/drawingml/2006/main" xmlns:pic="http://schemas.openxmlformats.org/drawingml/2006/picture">
-                  <wp:extent cx="655320" cy="204216"/>
+                  <wp:extent cx="637032" cy="195072"/>
                   <wp:docPr id="66" name="Picture 66"/>
                   <wp:cNvGraphicFramePr>
                     <a:graphicFrameLocks noChangeAspect="1"/>
@@ -5539,7 +5539,7 @@
                     <a:graphicData uri="http://schemas.openxmlformats.org/drawingml/2006/picture">
                       <pic:pic>
                         <pic:nvPicPr>
-                          <pic:cNvPr id="0" name="1f61a32cb3333d77.png"/>
+                          <pic:cNvPr id="0" name="8ae14348bcbf4295.png"/>
                           <pic:cNvPicPr/>
                         </pic:nvPicPr>
                         <pic:blipFill>
@@ -5551,7 +5551,7 @@
                         <pic:spPr>
                           <a:xfrm>
                             <a:off x="0" y="0"/>
-                            <a:ext cx="655320" cy="204216"/>
+                            <a:ext cx="637032" cy="195072"/>
                           </a:xfrm>
                           <a:prstGeom prst="rect"/>
                         </pic:spPr>
@@ -5624,7 +5624,7 @@
             <w:r>
               <w:drawing>
                 <wp:inline xmlns:a="http://schemas.openxmlformats.org/drawingml/2006/main" xmlns:pic="http://schemas.openxmlformats.org/drawingml/2006/picture">
-                  <wp:extent cx="914400" cy="204216"/>
+                  <wp:extent cx="868680" cy="195072"/>
                   <wp:docPr id="67" name="Picture 67"/>
                   <wp:cNvGraphicFramePr>
                     <a:graphicFrameLocks noChangeAspect="1"/>
@@ -5633,7 +5633,7 @@
                     <a:graphicData uri="http://schemas.openxmlformats.org/drawingml/2006/picture">
                       <pic:pic>
                         <pic:nvPicPr>
-                          <pic:cNvPr id="0" name="028350205b8ea22e.png"/>
+                          <pic:cNvPr id="0" name="1b87e4c9237c8767.png"/>
                           <pic:cNvPicPr/>
                         </pic:nvPicPr>
                         <pic:blipFill>
@@ -5645,7 +5645,7 @@
                         <pic:spPr>
                           <a:xfrm>
                             <a:off x="0" y="0"/>
-                            <a:ext cx="914400" cy="204216"/>
+                            <a:ext cx="868680" cy="195072"/>
                           </a:xfrm>
                           <a:prstGeom prst="rect"/>
                         </pic:spPr>
@@ -5676,7 +5676,7 @@
             <w:r>
               <w:drawing>
                 <wp:inline xmlns:a="http://schemas.openxmlformats.org/drawingml/2006/main" xmlns:pic="http://schemas.openxmlformats.org/drawingml/2006/picture">
-                  <wp:extent cx="222504" cy="216408"/>
+                  <wp:extent cx="204216" cy="198120"/>
                   <wp:docPr id="68" name="Picture 68"/>
                   <wp:cNvGraphicFramePr>
                     <a:graphicFrameLocks noChangeAspect="1"/>
@@ -5685,7 +5685,7 @@
                     <a:graphicData uri="http://schemas.openxmlformats.org/drawingml/2006/picture">
                       <pic:pic>
                         <pic:nvPicPr>
-                          <pic:cNvPr id="0" name="64453778f4253d99.png"/>
+                          <pic:cNvPr id="0" name="10efe54175c8cb12.png"/>
                           <pic:cNvPicPr/>
                         </pic:nvPicPr>
                         <pic:blipFill>
@@ -5697,7 +5697,7 @@
                         <pic:spPr>
                           <a:xfrm>
                             <a:off x="0" y="0"/>
-                            <a:ext cx="222504" cy="216408"/>
+                            <a:ext cx="204216" cy="198120"/>
                           </a:xfrm>
                           <a:prstGeom prst="rect"/>
                         </pic:spPr>
@@ -5716,7 +5716,7 @@
             <w:r>
               <w:drawing>
                 <wp:inline xmlns:a="http://schemas.openxmlformats.org/drawingml/2006/main" xmlns:pic="http://schemas.openxmlformats.org/drawingml/2006/picture">
-                  <wp:extent cx="408432" cy="213360"/>
+                  <wp:extent cx="396240" cy="198120"/>
                   <wp:docPr id="69" name="Picture 69"/>
                   <wp:cNvGraphicFramePr>
                     <a:graphicFrameLocks noChangeAspect="1"/>
@@ -5725,7 +5725,7 @@
                     <a:graphicData uri="http://schemas.openxmlformats.org/drawingml/2006/picture">
                       <pic:pic>
                         <pic:nvPicPr>
-                          <pic:cNvPr id="0" name="3a7a801abefdaf81.png"/>
+                          <pic:cNvPr id="0" name="29c696f5373de9db.png"/>
                           <pic:cNvPicPr/>
                         </pic:nvPicPr>
                         <pic:blipFill>
@@ -5737,7 +5737,7 @@
                         <pic:spPr>
                           <a:xfrm>
                             <a:off x="0" y="0"/>
-                            <a:ext cx="408432" cy="213360"/>
+                            <a:ext cx="396240" cy="198120"/>
                           </a:xfrm>
                           <a:prstGeom prst="rect"/>
                         </pic:spPr>
@@ -5777,7 +5777,7 @@
             <w:r>
               <w:drawing>
                 <wp:inline xmlns:a="http://schemas.openxmlformats.org/drawingml/2006/main" xmlns:pic="http://schemas.openxmlformats.org/drawingml/2006/picture">
-                  <wp:extent cx="835152" cy="265176"/>
+                  <wp:extent cx="789432" cy="249935"/>
                   <wp:docPr id="70" name="Picture 70"/>
                   <wp:cNvGraphicFramePr>
                     <a:graphicFrameLocks noChangeAspect="1"/>
@@ -5786,7 +5786,7 @@
                     <a:graphicData uri="http://schemas.openxmlformats.org/drawingml/2006/picture">
                       <pic:pic>
                         <pic:nvPicPr>
-                          <pic:cNvPr id="0" name="f4a440b3cb0f25a7.png"/>
+                          <pic:cNvPr id="0" name="be52e441507d38d4.png"/>
                           <pic:cNvPicPr/>
                         </pic:nvPicPr>
                         <pic:blipFill>
@@ -5798,7 +5798,7 @@
                         <pic:spPr>
                           <a:xfrm>
                             <a:off x="0" y="0"/>
-                            <a:ext cx="835152" cy="265176"/>
+                            <a:ext cx="789432" cy="249935"/>
                           </a:xfrm>
                           <a:prstGeom prst="rect"/>
                         </pic:spPr>
@@ -5829,7 +5829,7 @@
             <w:r>
               <w:drawing>
                 <wp:inline xmlns:a="http://schemas.openxmlformats.org/drawingml/2006/main" xmlns:pic="http://schemas.openxmlformats.org/drawingml/2006/picture">
-                  <wp:extent cx="60960" cy="210312"/>
+                  <wp:extent cx="64008" cy="201168"/>
                   <wp:docPr id="71" name="Picture 71"/>
                   <wp:cNvGraphicFramePr>
                     <a:graphicFrameLocks noChangeAspect="1"/>
@@ -5838,7 +5838,7 @@
                     <a:graphicData uri="http://schemas.openxmlformats.org/drawingml/2006/picture">
                       <pic:pic>
                         <pic:nvPicPr>
-                          <pic:cNvPr id="0" name="483f55c1cc9aed2b.png"/>
+                          <pic:cNvPr id="0" name="615108019f72e59e.png"/>
                           <pic:cNvPicPr/>
                         </pic:nvPicPr>
                         <pic:blipFill>
@@ -5850,7 +5850,7 @@
                         <pic:spPr>
                           <a:xfrm>
                             <a:off x="0" y="0"/>
-                            <a:ext cx="60960" cy="210312"/>
+                            <a:ext cx="64008" cy="201168"/>
                           </a:xfrm>
                           <a:prstGeom prst="rect"/>
                         </pic:spPr>
@@ -5869,7 +5869,7 @@
             <w:r>
               <w:drawing>
                 <wp:inline xmlns:a="http://schemas.openxmlformats.org/drawingml/2006/main" xmlns:pic="http://schemas.openxmlformats.org/drawingml/2006/picture">
-                  <wp:extent cx="301752" cy="216408"/>
+                  <wp:extent cx="295656" cy="201168"/>
                   <wp:docPr id="72" name="Picture 72"/>
                   <wp:cNvGraphicFramePr>
                     <a:graphicFrameLocks noChangeAspect="1"/>
@@ -5878,7 +5878,7 @@
                     <a:graphicData uri="http://schemas.openxmlformats.org/drawingml/2006/picture">
                       <pic:pic>
                         <pic:nvPicPr>
-                          <pic:cNvPr id="0" name="bbb837628d3974d3.png"/>
+                          <pic:cNvPr id="0" name="9c4f27ef0ef4478a.png"/>
                           <pic:cNvPicPr/>
                         </pic:nvPicPr>
                         <pic:blipFill>
@@ -5890,7 +5890,7 @@
                         <pic:spPr>
                           <a:xfrm>
                             <a:off x="0" y="0"/>
-                            <a:ext cx="301752" cy="216408"/>
+                            <a:ext cx="295656" cy="201168"/>
                           </a:xfrm>
                           <a:prstGeom prst="rect"/>
                         </pic:spPr>
@@ -6039,7 +6039,7 @@
             <w:r>
               <w:drawing>
                 <wp:inline xmlns:a="http://schemas.openxmlformats.org/drawingml/2006/main" xmlns:pic="http://schemas.openxmlformats.org/drawingml/2006/picture">
-                  <wp:extent cx="926592" cy="170688"/>
+                  <wp:extent cx="978408" cy="161544"/>
                   <wp:docPr id="73" name="Picture 73"/>
                   <wp:cNvGraphicFramePr>
                     <a:graphicFrameLocks noChangeAspect="1"/>
@@ -6048,7 +6048,7 @@
                     <a:graphicData uri="http://schemas.openxmlformats.org/drawingml/2006/picture">
                       <pic:pic>
                         <pic:nvPicPr>
-                          <pic:cNvPr id="0" name="1118768401e99f99.png"/>
+                          <pic:cNvPr id="0" name="9261c87f207561fb.png"/>
                           <pic:cNvPicPr/>
                         </pic:nvPicPr>
                         <pic:blipFill>
@@ -6060,7 +6060,7 @@
                         <pic:spPr>
                           <a:xfrm>
                             <a:off x="0" y="0"/>
-                            <a:ext cx="926592" cy="170688"/>
+                            <a:ext cx="978408" cy="161544"/>
                           </a:xfrm>
                           <a:prstGeom prst="rect"/>
                         </pic:spPr>
@@ -6148,7 +6148,7 @@
             <w:r>
               <w:drawing>
                 <wp:inline xmlns:a="http://schemas.openxmlformats.org/drawingml/2006/main" xmlns:pic="http://schemas.openxmlformats.org/drawingml/2006/picture">
-                  <wp:extent cx="1237488" cy="146304"/>
+                  <wp:extent cx="1310640" cy="140208"/>
                   <wp:docPr id="74" name="Picture 74"/>
                   <wp:cNvGraphicFramePr>
                     <a:graphicFrameLocks noChangeAspect="1"/>
@@ -6157,7 +6157,7 @@
                     <a:graphicData uri="http://schemas.openxmlformats.org/drawingml/2006/picture">
                       <pic:pic>
                         <pic:nvPicPr>
-                          <pic:cNvPr id="0" name="c7188ab9702bc2d2.png"/>
+                          <pic:cNvPr id="0" name="82e148edfb611661.png"/>
                           <pic:cNvPicPr/>
                         </pic:nvPicPr>
                         <pic:blipFill>
@@ -6169,7 +6169,7 @@
                         <pic:spPr>
                           <a:xfrm>
                             <a:off x="0" y="0"/>
-                            <a:ext cx="1237488" cy="146304"/>
+                            <a:ext cx="1310640" cy="140208"/>
                           </a:xfrm>
                           <a:prstGeom prst="rect"/>
                         </pic:spPr>
@@ -6191,7 +6191,7 @@
             <w:r>
               <w:drawing>
                 <wp:inline xmlns:a="http://schemas.openxmlformats.org/drawingml/2006/main" xmlns:pic="http://schemas.openxmlformats.org/drawingml/2006/picture">
-                  <wp:extent cx="262128" cy="121920"/>
+                  <wp:extent cx="259080" cy="109728"/>
                   <wp:docPr id="75" name="Picture 75"/>
                   <wp:cNvGraphicFramePr>
                     <a:graphicFrameLocks noChangeAspect="1"/>
@@ -6200,7 +6200,7 @@
                     <a:graphicData uri="http://schemas.openxmlformats.org/drawingml/2006/picture">
                       <pic:pic>
                         <pic:nvPicPr>
-                          <pic:cNvPr id="0" name="ad2ea2d48d75c8ac.png"/>
+                          <pic:cNvPr id="0" name="3a80b15c59e6825d.png"/>
                           <pic:cNvPicPr/>
                         </pic:nvPicPr>
                         <pic:blipFill>
@@ -6212,7 +6212,7 @@
                         <pic:spPr>
                           <a:xfrm>
                             <a:off x="0" y="0"/>
-                            <a:ext cx="262128" cy="121920"/>
+                            <a:ext cx="259080" cy="109728"/>
                           </a:xfrm>
                           <a:prstGeom prst="rect"/>
                         </pic:spPr>
@@ -6319,7 +6319,7 @@
             <w:r>
               <w:drawing>
                 <wp:inline xmlns:a="http://schemas.openxmlformats.org/drawingml/2006/main" xmlns:pic="http://schemas.openxmlformats.org/drawingml/2006/picture">
-                  <wp:extent cx="554736" cy="146304"/>
+                  <wp:extent cx="554736" cy="134112"/>
                   <wp:docPr id="76" name="Picture 76"/>
                   <wp:cNvGraphicFramePr>
                     <a:graphicFrameLocks noChangeAspect="1"/>
@@ -6328,7 +6328,7 @@
                     <a:graphicData uri="http://schemas.openxmlformats.org/drawingml/2006/picture">
                       <pic:pic>
                         <pic:nvPicPr>
-                          <pic:cNvPr id="0" name="9febc7e713497aae.png"/>
+                          <pic:cNvPr id="0" name="7d8b95f65635d68c.png"/>
                           <pic:cNvPicPr/>
                         </pic:nvPicPr>
                         <pic:blipFill>
@@ -6340,7 +6340,7 @@
                         <pic:spPr>
                           <a:xfrm>
                             <a:off x="0" y="0"/>
-                            <a:ext cx="554736" cy="146304"/>
+                            <a:ext cx="554736" cy="134112"/>
                           </a:xfrm>
                           <a:prstGeom prst="rect"/>
                         </pic:spPr>
@@ -6611,7 +6611,7 @@
             <w:r>
               <w:drawing>
                 <wp:inline xmlns:a="http://schemas.openxmlformats.org/drawingml/2006/main" xmlns:pic="http://schemas.openxmlformats.org/drawingml/2006/picture">
-                  <wp:extent cx="466344" cy="204216"/>
+                  <wp:extent cx="445008" cy="195072"/>
                   <wp:docPr id="77" name="Picture 77"/>
                   <wp:cNvGraphicFramePr>
                     <a:graphicFrameLocks noChangeAspect="1"/>
@@ -6620,7 +6620,7 @@
                     <a:graphicData uri="http://schemas.openxmlformats.org/drawingml/2006/picture">
                       <pic:pic>
                         <pic:nvPicPr>
-                          <pic:cNvPr id="0" name="a4a5570bcf96386b.png"/>
+                          <pic:cNvPr id="0" name="3566b1c72543253e.png"/>
                           <pic:cNvPicPr/>
                         </pic:nvPicPr>
                         <pic:blipFill>
@@ -6632,7 +6632,7 @@
                         <pic:spPr>
                           <a:xfrm>
                             <a:off x="0" y="0"/>
-                            <a:ext cx="466344" cy="204216"/>
+                            <a:ext cx="445008" cy="195072"/>
                           </a:xfrm>
                           <a:prstGeom prst="rect"/>
                         </pic:spPr>
@@ -6670,7 +6670,7 @@
             <w:r>
               <w:drawing>
                 <wp:inline xmlns:a="http://schemas.openxmlformats.org/drawingml/2006/main" xmlns:pic="http://schemas.openxmlformats.org/drawingml/2006/picture">
-                  <wp:extent cx="344424" cy="204216"/>
+                  <wp:extent cx="344424" cy="195072"/>
                   <wp:docPr id="78" name="Picture 78"/>
                   <wp:cNvGraphicFramePr>
                     <a:graphicFrameLocks noChangeAspect="1"/>
@@ -6679,7 +6679,7 @@
                     <a:graphicData uri="http://schemas.openxmlformats.org/drawingml/2006/picture">
                       <pic:pic>
                         <pic:nvPicPr>
-                          <pic:cNvPr id="0" name="9be853e87ebca1a6.png"/>
+                          <pic:cNvPr id="0" name="e272b89ba5523ded.png"/>
                           <pic:cNvPicPr/>
                         </pic:nvPicPr>
                         <pic:blipFill>
@@ -6691,7 +6691,7 @@
                         <pic:spPr>
                           <a:xfrm>
                             <a:off x="0" y="0"/>
-                            <a:ext cx="344424" cy="204216"/>
+                            <a:ext cx="344424" cy="195072"/>
                           </a:xfrm>
                           <a:prstGeom prst="rect"/>
                         </pic:spPr>
@@ -6729,7 +6729,7 @@
             <w:r>
               <w:drawing>
                 <wp:inline xmlns:a="http://schemas.openxmlformats.org/drawingml/2006/main" xmlns:pic="http://schemas.openxmlformats.org/drawingml/2006/picture">
-                  <wp:extent cx="554736" cy="118872"/>
+                  <wp:extent cx="579120" cy="112776"/>
                   <wp:docPr id="79" name="Picture 79"/>
                   <wp:cNvGraphicFramePr>
                     <a:graphicFrameLocks noChangeAspect="1"/>
@@ -6738,7 +6738,7 @@
                     <a:graphicData uri="http://schemas.openxmlformats.org/drawingml/2006/picture">
                       <pic:pic>
                         <pic:nvPicPr>
-                          <pic:cNvPr id="0" name="17ed3fba114a4e1a.png"/>
+                          <pic:cNvPr id="0" name="0d1351814b203c61.png"/>
                           <pic:cNvPicPr/>
                         </pic:nvPicPr>
                         <pic:blipFill>
@@ -6750,7 +6750,7 @@
                         <pic:spPr>
                           <a:xfrm>
                             <a:off x="0" y="0"/>
-                            <a:ext cx="554736" cy="118872"/>
+                            <a:ext cx="579120" cy="112776"/>
                           </a:xfrm>
                           <a:prstGeom prst="rect"/>
                         </pic:spPr>
@@ -6788,7 +6788,7 @@
             <w:r>
               <w:drawing>
                 <wp:inline xmlns:a="http://schemas.openxmlformats.org/drawingml/2006/main" xmlns:pic="http://schemas.openxmlformats.org/drawingml/2006/picture">
-                  <wp:extent cx="344424" cy="219456"/>
+                  <wp:extent cx="323088" cy="201168"/>
                   <wp:docPr id="80" name="Picture 80"/>
                   <wp:cNvGraphicFramePr>
                     <a:graphicFrameLocks noChangeAspect="1"/>
@@ -6797,7 +6797,7 @@
                     <a:graphicData uri="http://schemas.openxmlformats.org/drawingml/2006/picture">
                       <pic:pic>
                         <pic:nvPicPr>
-                          <pic:cNvPr id="0" name="a9c26db8beeebb45.png"/>
+                          <pic:cNvPr id="0" name="0238f4c88fa25402.png"/>
                           <pic:cNvPicPr/>
                         </pic:nvPicPr>
                         <pic:blipFill>
@@ -6809,7 +6809,7 @@
                         <pic:spPr>
                           <a:xfrm>
                             <a:off x="0" y="0"/>
-                            <a:ext cx="344424" cy="219456"/>
+                            <a:ext cx="323088" cy="201168"/>
                           </a:xfrm>
                           <a:prstGeom prst="rect"/>
                         </pic:spPr>
@@ -6847,7 +6847,7 @@
             <w:r>
               <w:drawing>
                 <wp:inline xmlns:a="http://schemas.openxmlformats.org/drawingml/2006/main" xmlns:pic="http://schemas.openxmlformats.org/drawingml/2006/picture">
-                  <wp:extent cx="655320" cy="204216"/>
+                  <wp:extent cx="633984" cy="195072"/>
                   <wp:docPr id="81" name="Picture 81"/>
                   <wp:cNvGraphicFramePr>
                     <a:graphicFrameLocks noChangeAspect="1"/>
@@ -6856,7 +6856,7 @@
                     <a:graphicData uri="http://schemas.openxmlformats.org/drawingml/2006/picture">
                       <pic:pic>
                         <pic:nvPicPr>
-                          <pic:cNvPr id="0" name="8a6606252c202cb0.png"/>
+                          <pic:cNvPr id="0" name="a5c6a59e5e283e91.png"/>
                           <pic:cNvPicPr/>
                         </pic:nvPicPr>
                         <pic:blipFill>
@@ -6868,7 +6868,7 @@
                         <pic:spPr>
                           <a:xfrm>
                             <a:off x="0" y="0"/>
-                            <a:ext cx="655320" cy="204216"/>
+                            <a:ext cx="633984" cy="195072"/>
                           </a:xfrm>
                           <a:prstGeom prst="rect"/>
                         </pic:spPr>
@@ -6906,7 +6906,7 @@
             <w:r>
               <w:drawing>
                 <wp:inline xmlns:a="http://schemas.openxmlformats.org/drawingml/2006/main" xmlns:pic="http://schemas.openxmlformats.org/drawingml/2006/picture">
-                  <wp:extent cx="280416" cy="231648"/>
+                  <wp:extent cx="286512" cy="216408"/>
                   <wp:docPr id="82" name="Picture 82"/>
                   <wp:cNvGraphicFramePr>
                     <a:graphicFrameLocks noChangeAspect="1"/>
@@ -6915,7 +6915,7 @@
                     <a:graphicData uri="http://schemas.openxmlformats.org/drawingml/2006/picture">
                       <pic:pic>
                         <pic:nvPicPr>
-                          <pic:cNvPr id="0" name="b42f0b858a323c4c.png"/>
+                          <pic:cNvPr id="0" name="b7ecb0dbb5869b9c.png"/>
                           <pic:cNvPicPr/>
                         </pic:nvPicPr>
                         <pic:blipFill>
@@ -6927,7 +6927,7 @@
                         <pic:spPr>
                           <a:xfrm>
                             <a:off x="0" y="0"/>
-                            <a:ext cx="280416" cy="231648"/>
+                            <a:ext cx="286512" cy="216408"/>
                           </a:xfrm>
                           <a:prstGeom prst="rect"/>
                         </pic:spPr>
@@ -7055,7 +7055,7 @@
             <w:r>
               <w:drawing>
                 <wp:inline xmlns:a="http://schemas.openxmlformats.org/drawingml/2006/main" xmlns:pic="http://schemas.openxmlformats.org/drawingml/2006/picture">
-                  <wp:extent cx="2188464" cy="204216"/>
+                  <wp:extent cx="2185416" cy="195072"/>
                   <wp:docPr id="83" name="Picture 83"/>
                   <wp:cNvGraphicFramePr>
                     <a:graphicFrameLocks noChangeAspect="1"/>
@@ -7064,7 +7064,7 @@
                     <a:graphicData uri="http://schemas.openxmlformats.org/drawingml/2006/picture">
                       <pic:pic>
                         <pic:nvPicPr>
-                          <pic:cNvPr id="0" name="5ce16d40b9e81ea5.png"/>
+                          <pic:cNvPr id="0" name="34b56871cd686d37.png"/>
                           <pic:cNvPicPr/>
                         </pic:nvPicPr>
                         <pic:blipFill>
@@ -7076,7 +7076,7 @@
                         <pic:spPr>
                           <a:xfrm>
                             <a:off x="0" y="0"/>
-                            <a:ext cx="2188464" cy="204216"/>
+                            <a:ext cx="2185416" cy="195072"/>
                           </a:xfrm>
                           <a:prstGeom prst="rect"/>
                         </pic:spPr>
@@ -7125,7 +7125,7 @@
             <w:r>
               <w:drawing>
                 <wp:inline xmlns:a="http://schemas.openxmlformats.org/drawingml/2006/main" xmlns:pic="http://schemas.openxmlformats.org/drawingml/2006/picture">
-                  <wp:extent cx="737616" cy="204216"/>
+                  <wp:extent cx="722376" cy="195072"/>
                   <wp:docPr id="84" name="Picture 84"/>
                   <wp:cNvGraphicFramePr>
                     <a:graphicFrameLocks noChangeAspect="1"/>
@@ -7134,7 +7134,7 @@
                     <a:graphicData uri="http://schemas.openxmlformats.org/drawingml/2006/picture">
                       <pic:pic>
                         <pic:nvPicPr>
-                          <pic:cNvPr id="0" name="58c7b2a9f6c96ae3.png"/>
+                          <pic:cNvPr id="0" name="84b81c4745940a87.png"/>
                           <pic:cNvPicPr/>
                         </pic:nvPicPr>
                         <pic:blipFill>
@@ -7146,7 +7146,7 @@
                         <pic:spPr>
                           <a:xfrm>
                             <a:off x="0" y="0"/>
-                            <a:ext cx="737616" cy="204216"/>
+                            <a:ext cx="722376" cy="195072"/>
                           </a:xfrm>
                           <a:prstGeom prst="rect"/>
                         </pic:spPr>
@@ -7310,7 +7310,7 @@
             <w:r>
               <w:drawing>
                 <wp:inline xmlns:a="http://schemas.openxmlformats.org/drawingml/2006/main" xmlns:pic="http://schemas.openxmlformats.org/drawingml/2006/picture">
-                  <wp:extent cx="737616" cy="204216"/>
+                  <wp:extent cx="722376" cy="195072"/>
                   <wp:docPr id="85" name="Picture 85"/>
                   <wp:cNvGraphicFramePr>
                     <a:graphicFrameLocks noChangeAspect="1"/>
@@ -7319,7 +7319,7 @@
                     <a:graphicData uri="http://schemas.openxmlformats.org/drawingml/2006/picture">
                       <pic:pic>
                         <pic:nvPicPr>
-                          <pic:cNvPr id="0" name="3879800f780de45d.png"/>
+                          <pic:cNvPr id="0" name="3e53f400b46b6700.png"/>
                           <pic:cNvPicPr/>
                         </pic:nvPicPr>
                         <pic:blipFill>
@@ -7331,7 +7331,7 @@
                         <pic:spPr>
                           <a:xfrm>
                             <a:off x="0" y="0"/>
-                            <a:ext cx="737616" cy="204216"/>
+                            <a:ext cx="722376" cy="195072"/>
                           </a:xfrm>
                           <a:prstGeom prst="rect"/>
                         </pic:spPr>
@@ -7353,7 +7353,7 @@
             <w:r>
               <w:drawing>
                 <wp:inline xmlns:a="http://schemas.openxmlformats.org/drawingml/2006/main" xmlns:pic="http://schemas.openxmlformats.org/drawingml/2006/picture">
-                  <wp:extent cx="633984" cy="143256"/>
+                  <wp:extent cx="630936" cy="131064"/>
                   <wp:docPr id="86" name="Picture 86"/>
                   <wp:cNvGraphicFramePr>
                     <a:graphicFrameLocks noChangeAspect="1"/>
@@ -7362,7 +7362,7 @@
                     <a:graphicData uri="http://schemas.openxmlformats.org/drawingml/2006/picture">
                       <pic:pic>
                         <pic:nvPicPr>
-                          <pic:cNvPr id="0" name="f64e483d46aa9764.png"/>
+                          <pic:cNvPr id="0" name="df03f1c1d751f608.png"/>
                           <pic:cNvPicPr/>
                         </pic:nvPicPr>
                         <pic:blipFill>
@@ -7374,7 +7374,7 @@
                         <pic:spPr>
                           <a:xfrm>
                             <a:off x="0" y="0"/>
-                            <a:ext cx="633984" cy="143256"/>
+                            <a:ext cx="630936" cy="131064"/>
                           </a:xfrm>
                           <a:prstGeom prst="rect"/>
                         </pic:spPr>
@@ -8505,7 +8505,7 @@
       <w:spacing w:after="0"/>
     </w:pPr>
     <w:rPr>
-      <w:rFonts w:ascii="Times New Roman" w:hAnsi="Times New Roman" w:eastAsia="Times New Roman"/>
+      <w:rFonts w:ascii="Lexend" w:hAnsi="Lexend" w:eastAsia="Lexend"/>
       <w:color w:val="1A1A1A"/>
       <w:sz w:val="22"/>
     </w:rPr>

</xml_diff>